<commit_message>
Connect Supabase: signed-in profile, prediction runs and history
- src/api/supabase_client.py: verifies access tokens with Supabase Auth
  (cached 60 s) and calls PostgREST with the user's own token, so RLS
  applies to every read and write.
- src/api/me.py: GET/PUT /api/me/profile, POST /api/me/risk (predict with
  the saved profile, save the run and its days), GET /api/me/history,
  GET/DELETE /api/me/history/{id}. A failed day insert removes the run.
- tests/test_me.py: 12 tests against an in-memory Supabase fake that
  emulates RLS (41 tests total). scripts/check_accounts_live.py: live
  end-to-end check with a real test user.
- README, CLAUDE.md and the progress report updated; python-dotenv and
  httpx listed as runtime dependencies.

Co-Authored-By: Claude Opus 5.5 <noreply@anthropic.com>
</commit_message>
<xml_diff>
--- a/docs/Project_Progress.docx
+++ b/docs/Project_Progress.docx
@@ -47,7 +47,7 @@
           <w:sz w:val="18"/>
           <w:szCs w:val="18"/>
         </w:rPr>
-        <w:t xml:space="preserve">Last updated: 26 September 2026    |    Latest commit: Supabase schema and progress report (26 Sep 2026)</w:t>
+        <w:t xml:space="preserve">Last updated: 26 September 2026    |    Latest commit: Supabase accounts: profile, prediction history (26 Sep 2026)</w:t>
       </w:r>
     </w:p>
     <w:p>
@@ -621,7 +621,7 @@
                 <w:sz w:val="19"/>
                 <w:szCs w:val="19"/>
               </w:rPr>
-              <w:t xml:space="preserve">7 endpoints, 29 passing tests</w:t>
+              <w:t xml:space="preserve">7 endpoints</w:t>
             </w:r>
           </w:p>
         </w:tc>
@@ -652,7 +652,7 @@
                 <w:sz w:val="19"/>
                 <w:szCs w:val="19"/>
               </w:rPr>
-              <w:t xml:space="preserve">Supabase: database design</w:t>
+              <w:t xml:space="preserve">Supabase: database and sign-in</w:t>
             </w:r>
           </w:p>
         </w:tc>
@@ -711,7 +711,7 @@
                 <w:sz w:val="19"/>
                 <w:szCs w:val="19"/>
               </w:rPr>
-              <w:t xml:space="preserve">Tables, row-level security, setup guide ready to run</w:t>
+              <w:t xml:space="preserve">Project created, tables and row-level security live and verified</w:t>
             </w:r>
           </w:p>
         </w:tc>
@@ -742,7 +742,7 @@
                 <w:sz w:val="19"/>
                 <w:szCs w:val="19"/>
               </w:rPr>
-              <w:t xml:space="preserve">Supabase: project creation</w:t>
+              <w:t xml:space="preserve">Backend: sign-in, saved profile, history</w:t>
             </w:r>
           </w:p>
         </w:tc>
@@ -755,24 +755,24 @@
               <w:bottom w:val="single" w:color="BFBFBF" w:sz="4"/>
               <w:right w:val="single" w:color="BFBFBF" w:sz="4"/>
             </w:tcBorders>
-            <w:shd w:fill="FFF2CC" w:color="auto" w:val="clear"/>
-            <w:tcMar>
-              <w:top w:type="dxa" w:w="60"/>
-              <w:left w:type="dxa" w:w="100"/>
-              <w:bottom w:type="dxa" w:w="60"/>
-              <w:right w:type="dxa" w:w="100"/>
-            </w:tcMar>
-          </w:tcPr>
-          <w:p>
-            <w:r>
-              <w:rPr>
-                <w:rFonts w:ascii="Calibri" w:cs="Calibri" w:eastAsia="Calibri" w:hAnsi="Calibri"/>
-                <w:b w:val="false"/>
-                <w:bCs w:val="false"/>
-                <w:sz w:val="19"/>
-                <w:szCs w:val="19"/>
-              </w:rPr>
-              <w:t xml:space="preserve">Waiting on you</w:t>
+            <w:shd w:fill="E2EFDA" w:color="auto" w:val="clear"/>
+            <w:tcMar>
+              <w:top w:type="dxa" w:w="60"/>
+              <w:left w:type="dxa" w:w="100"/>
+              <w:bottom w:type="dxa" w:w="60"/>
+              <w:right w:type="dxa" w:w="100"/>
+            </w:tcMar>
+          </w:tcPr>
+          <w:p>
+            <w:r>
+              <w:rPr>
+                <w:rFonts w:ascii="Calibri" w:cs="Calibri" w:eastAsia="Calibri" w:hAnsi="Calibri"/>
+                <w:b w:val="false"/>
+                <w:bCs w:val="false"/>
+                <w:sz w:val="19"/>
+                <w:szCs w:val="19"/>
+              </w:rPr>
+              <w:t xml:space="preserve">Done</w:t>
             </w:r>
           </w:p>
         </w:tc>
@@ -801,7 +801,7 @@
                 <w:sz w:val="19"/>
                 <w:szCs w:val="19"/>
               </w:rPr>
-              <w:t xml:space="preserve">Create the project and run the SQL script</w:t>
+              <w:t xml:space="preserve">5 signed-in endpoints; 41 tests pass in total</w:t>
             </w:r>
           </w:p>
         </w:tc>
@@ -832,7 +832,7 @@
                 <w:sz w:val="19"/>
                 <w:szCs w:val="19"/>
               </w:rPr>
-              <w:t xml:space="preserve">Backend: sign-in, saved profile, history</w:t>
+              <w:t xml:space="preserve">Live check with a real test user</w:t>
             </w:r>
           </w:p>
         </w:tc>
@@ -845,24 +845,24 @@
               <w:bottom w:val="single" w:color="BFBFBF" w:sz="4"/>
               <w:right w:val="single" w:color="BFBFBF" w:sz="4"/>
             </w:tcBorders>
-            <w:shd w:fill="F2F2F2" w:color="auto" w:val="clear"/>
-            <w:tcMar>
-              <w:top w:type="dxa" w:w="60"/>
-              <w:left w:type="dxa" w:w="100"/>
-              <w:bottom w:type="dxa" w:w="60"/>
-              <w:right w:type="dxa" w:w="100"/>
-            </w:tcMar>
-          </w:tcPr>
-          <w:p>
-            <w:r>
-              <w:rPr>
-                <w:rFonts w:ascii="Calibri" w:cs="Calibri" w:eastAsia="Calibri" w:hAnsi="Calibri"/>
-                <w:b w:val="false"/>
-                <w:bCs w:val="false"/>
-                <w:sz w:val="19"/>
-                <w:szCs w:val="19"/>
-              </w:rPr>
-              <w:t xml:space="preserve">Not started</w:t>
+            <w:shd w:fill="FFF2CC" w:color="auto" w:val="clear"/>
+            <w:tcMar>
+              <w:top w:type="dxa" w:w="60"/>
+              <w:left w:type="dxa" w:w="100"/>
+              <w:bottom w:type="dxa" w:w="60"/>
+              <w:right w:type="dxa" w:w="100"/>
+            </w:tcMar>
+          </w:tcPr>
+          <w:p>
+            <w:r>
+              <w:rPr>
+                <w:rFonts w:ascii="Calibri" w:cs="Calibri" w:eastAsia="Calibri" w:hAnsi="Calibri"/>
+                <w:b w:val="false"/>
+                <w:bCs w:val="false"/>
+                <w:sz w:val="19"/>
+                <w:szCs w:val="19"/>
+              </w:rPr>
+              <w:t xml:space="preserve">Waiting on you</w:t>
             </w:r>
           </w:p>
         </w:tc>
@@ -891,7 +891,7 @@
                 <w:sz w:val="19"/>
                 <w:szCs w:val="19"/>
               </w:rPr>
-              <w:t xml:space="preserve">Needs the Supabase project</w:t>
+              <w:t xml:space="preserve">Run scripts/check_accounts_live.py (about 2 minutes)</w:t>
             </w:r>
           </w:p>
         </w:tc>
@@ -1477,7 +1477,7 @@
         <w:rPr>
           <w:rFonts w:ascii="Calibri" w:cs="Calibri" w:eastAsia="Calibri" w:hAnsi="Calibri"/>
         </w:rPr>
-        <w:t xml:space="preserve">Create the Supabase project and run supabase/migrations/0001_init.sql (steps in supabase/README.md).</w:t>
+        <w:t xml:space="preserve">In Supabase: Authentication &gt; Users &gt; Add user &gt; Create new user (tick Auto Confirm User) to make a test account.</w:t>
       </w:r>
     </w:p>
     <w:p>
@@ -1493,7 +1493,7 @@
         <w:rPr>
           <w:rFonts w:ascii="Calibri" w:cs="Calibri" w:eastAsia="Calibri" w:hAnsi="Calibri"/>
         </w:rPr>
-        <w:t xml:space="preserve">Share the Supabase project URL and anon key so the backend can be connected. Keep the service role key in your local .env only.</w:t>
+        <w:t xml:space="preserve">With the project venv active, run: python scripts/check_accounts_live.py, then type the test user's email and password when asked.</w:t>
       </w:r>
     </w:p>
     <w:p>
@@ -1858,7 +1858,71 @@
         <w:rPr>
           <w:rFonts w:ascii="Calibri" w:cs="Calibri" w:eastAsia="Calibri" w:hAnsi="Calibri"/>
         </w:rPr>
-        <w:t xml:space="preserve">Supabase (database design)</w:t>
+        <w:t xml:space="preserve">Supabase and user accounts</w:t>
+      </w:r>
+    </w:p>
+    <w:p>
+      <w:pPr>
+        <w:pStyle w:val="ListParagraph"/>
+        <w:numPr>
+          <w:ilvl w:val="0"/>
+          <w:numId w:val="2"/>
+        </w:numPr>
+        <w:spacing w:after="60"/>
+      </w:pPr>
+      <w:r>
+        <w:rPr>
+          <w:rFonts w:ascii="Calibri" w:cs="Calibri" w:eastAsia="Calibri" w:hAnsi="Calibri"/>
+        </w:rPr>
+        <w:t xml:space="preserve">Supabase project created (Mumbai region); database script run; checks confirmed public tables are readable, private tables are blocked without sign-in, and the public key can't write.</w:t>
+      </w:r>
+    </w:p>
+    <w:p>
+      <w:pPr>
+        <w:pStyle w:val="ListParagraph"/>
+        <w:numPr>
+          <w:ilvl w:val="0"/>
+          <w:numId w:val="2"/>
+        </w:numPr>
+        <w:spacing w:after="60"/>
+      </w:pPr>
+      <w:r>
+        <w:rPr>
+          <w:rFonts w:ascii="Calibri" w:cs="Calibri" w:eastAsia="Calibri" w:hAnsi="Calibri"/>
+        </w:rPr>
+        <w:t xml:space="preserve">Signed-in endpoints: GET/PUT /api/me/profile, POST /api/me/risk (runs a prediction with the saved profile and saves it to history), GET /api/me/history, GET/DELETE /api/me/history/{id}.</w:t>
+      </w:r>
+    </w:p>
+    <w:p>
+      <w:pPr>
+        <w:pStyle w:val="ListParagraph"/>
+        <w:numPr>
+          <w:ilvl w:val="0"/>
+          <w:numId w:val="2"/>
+        </w:numPr>
+        <w:spacing w:after="60"/>
+      </w:pPr>
+      <w:r>
+        <w:rPr>
+          <w:rFonts w:ascii="Calibri" w:cs="Calibri" w:eastAsia="Calibri" w:hAnsi="Calibri"/>
+        </w:rPr>
+        <w:t xml:space="preserve">Each database call is made with the user's own sign-in token, so row-level security keeps every user's profile and history private, even inside the backend.</w:t>
+      </w:r>
+    </w:p>
+    <w:p>
+      <w:pPr>
+        <w:pStyle w:val="ListParagraph"/>
+        <w:numPr>
+          <w:ilvl w:val="0"/>
+          <w:numId w:val="2"/>
+        </w:numPr>
+        <w:spacing w:after="60"/>
+      </w:pPr>
+      <w:r>
+        <w:rPr>
+          <w:rFonts w:ascii="Calibri" w:cs="Calibri" w:eastAsia="Calibri" w:hAnsi="Calibri"/>
+        </w:rPr>
+        <w:t xml:space="preserve">12 new tests using an in-memory stand-in for Supabase that enforces the same per-user rules (41 tests pass in total); the real sign-in service correctly rejects invalid tokens.</w:t>
       </w:r>
     </w:p>
     <w:p>
@@ -4406,7 +4470,7 @@
                 <w:sz w:val="19"/>
                 <w:szCs w:val="19"/>
               </w:rPr>
-              <w:t xml:space="preserve">Create the Supabase project and run the SQL script</w:t>
+              <w:t xml:space="preserve">Live accounts check with a real test user</w:t>
             </w:r>
           </w:p>
         </w:tc>
@@ -4464,96 +4528,7 @@
                 <w:sz w:val="19"/>
                 <w:szCs w:val="19"/>
               </w:rPr>
-              <w:t xml:space="preserve">Follow supabase/README.md; share the project URL and anon key (never the service role key)</w:t>
-            </w:r>
-          </w:p>
-        </w:tc>
-      </w:tr>
-      <w:tr>
-        <w:tc>
-          <w:tcPr>
-            <w:tcW w:type="dxa" w:w="3300"/>
-            <w:tcBorders>
-              <w:top w:val="single" w:color="BFBFBF" w:sz="4"/>
-              <w:left w:val="single" w:color="BFBFBF" w:sz="4"/>
-              <w:bottom w:val="single" w:color="BFBFBF" w:sz="4"/>
-              <w:right w:val="single" w:color="BFBFBF" w:sz="4"/>
-            </w:tcBorders>
-            <w:tcMar>
-              <w:top w:type="dxa" w:w="60"/>
-              <w:left w:type="dxa" w:w="100"/>
-              <w:bottom w:type="dxa" w:w="60"/>
-              <w:right w:type="dxa" w:w="100"/>
-            </w:tcMar>
-          </w:tcPr>
-          <w:p>
-            <w:r>
-              <w:rPr>
-                <w:rFonts w:ascii="Calibri" w:cs="Calibri" w:eastAsia="Calibri" w:hAnsi="Calibri"/>
-                <w:b w:val="false"/>
-                <w:bCs w:val="false"/>
-                <w:sz w:val="19"/>
-                <w:szCs w:val="19"/>
-              </w:rPr>
-              <w:t xml:space="preserve">Backend: sign-in checks, saved profile, prediction history</w:t>
-            </w:r>
-          </w:p>
-        </w:tc>
-        <w:tc>
-          <w:tcPr>
-            <w:tcW w:type="dxa" w:w="1600"/>
-            <w:tcBorders>
-              <w:top w:val="single" w:color="BFBFBF" w:sz="4"/>
-              <w:left w:val="single" w:color="BFBFBF" w:sz="4"/>
-              <w:bottom w:val="single" w:color="BFBFBF" w:sz="4"/>
-              <w:right w:val="single" w:color="BFBFBF" w:sz="4"/>
-            </w:tcBorders>
-            <w:tcMar>
-              <w:top w:type="dxa" w:w="60"/>
-              <w:left w:type="dxa" w:w="100"/>
-              <w:bottom w:type="dxa" w:w="60"/>
-              <w:right w:type="dxa" w:w="100"/>
-            </w:tcMar>
-          </w:tcPr>
-          <w:p>
-            <w:r>
-              <w:rPr>
-                <w:rFonts w:ascii="Calibri" w:cs="Calibri" w:eastAsia="Calibri" w:hAnsi="Calibri"/>
-                <w:b w:val="false"/>
-                <w:bCs w:val="false"/>
-                <w:sz w:val="19"/>
-                <w:szCs w:val="19"/>
-              </w:rPr>
-              <w:t xml:space="preserve">Supabase project</w:t>
-            </w:r>
-          </w:p>
-        </w:tc>
-        <w:tc>
-          <w:tcPr>
-            <w:tcW w:type="dxa" w:w="4738"/>
-            <w:tcBorders>
-              <w:top w:val="single" w:color="BFBFBF" w:sz="4"/>
-              <w:left w:val="single" w:color="BFBFBF" w:sz="4"/>
-              <w:bottom w:val="single" w:color="BFBFBF" w:sz="4"/>
-              <w:right w:val="single" w:color="BFBFBF" w:sz="4"/>
-            </w:tcBorders>
-            <w:tcMar>
-              <w:top w:type="dxa" w:w="60"/>
-              <w:left w:type="dxa" w:w="100"/>
-              <w:bottom w:type="dxa" w:w="60"/>
-              <w:right w:type="dxa" w:w="100"/>
-            </w:tcMar>
-          </w:tcPr>
-          <w:p>
-            <w:r>
-              <w:rPr>
-                <w:rFonts w:ascii="Calibri" w:cs="Calibri" w:eastAsia="Calibri" w:hAnsi="Calibri"/>
-                <w:b w:val="false"/>
-                <w:bCs w:val="false"/>
-                <w:sz w:val="19"/>
-                <w:szCs w:val="19"/>
-              </w:rPr>
-              <w:t xml:space="preserve">Private endpoints; saves each run to the user's history</w:t>
+              <w:t xml:space="preserve">Create a test user in the dashboard (Auto Confirm) and run scripts/check_accounts_live.py</w:t>
             </w:r>
           </w:p>
         </w:tc>
@@ -5242,6 +5217,66 @@
                 <w:szCs w:val="19"/>
               </w:rPr>
               <w:t xml:space="preserve">What changed</w:t>
+            </w:r>
+          </w:p>
+        </w:tc>
+      </w:tr>
+      <w:tr>
+        <w:tc>
+          <w:tcPr>
+            <w:tcW w:type="dxa" w:w="1900"/>
+            <w:tcBorders>
+              <w:top w:val="single" w:color="BFBFBF" w:sz="4"/>
+              <w:left w:val="single" w:color="BFBFBF" w:sz="4"/>
+              <w:bottom w:val="single" w:color="BFBFBF" w:sz="4"/>
+              <w:right w:val="single" w:color="BFBFBF" w:sz="4"/>
+            </w:tcBorders>
+            <w:tcMar>
+              <w:top w:type="dxa" w:w="60"/>
+              <w:left w:type="dxa" w:w="100"/>
+              <w:bottom w:type="dxa" w:w="60"/>
+              <w:right w:type="dxa" w:w="100"/>
+            </w:tcMar>
+          </w:tcPr>
+          <w:p>
+            <w:r>
+              <w:rPr>
+                <w:rFonts w:ascii="Calibri" w:cs="Calibri" w:eastAsia="Calibri" w:hAnsi="Calibri"/>
+                <w:b w:val="false"/>
+                <w:bCs w:val="false"/>
+                <w:sz w:val="19"/>
+                <w:szCs w:val="19"/>
+              </w:rPr>
+              <w:t xml:space="preserve">26 Sep 2026</w:t>
+            </w:r>
+          </w:p>
+        </w:tc>
+        <w:tc>
+          <w:tcPr>
+            <w:tcW w:type="dxa" w:w="7738"/>
+            <w:tcBorders>
+              <w:top w:val="single" w:color="BFBFBF" w:sz="4"/>
+              <w:left w:val="single" w:color="BFBFBF" w:sz="4"/>
+              <w:bottom w:val="single" w:color="BFBFBF" w:sz="4"/>
+              <w:right w:val="single" w:color="BFBFBF" w:sz="4"/>
+            </w:tcBorders>
+            <w:tcMar>
+              <w:top w:type="dxa" w:w="60"/>
+              <w:left w:type="dxa" w:w="100"/>
+              <w:bottom w:type="dxa" w:w="60"/>
+              <w:right w:type="dxa" w:w="100"/>
+            </w:tcMar>
+          </w:tcPr>
+          <w:p>
+            <w:r>
+              <w:rPr>
+                <w:rFonts w:ascii="Calibri" w:cs="Calibri" w:eastAsia="Calibri" w:hAnsi="Calibri"/>
+                <w:b w:val="false"/>
+                <w:bCs w:val="false"/>
+                <w:sz w:val="19"/>
+                <w:szCs w:val="19"/>
+              </w:rPr>
+              <w:t xml:space="preserve">Supabase connected: signed-in endpoints for profile, prediction runs and history; 41 tests.</w:t>
             </w:r>
           </w:p>
         </w:tc>

</xml_diff>

<commit_message>
Frontend design: Airware landing page and dashboard specs
- docs/frontend_design.md: agreed frontend stack, design rules (data-first,
  IBM Plex, neutral + deep-teal, CPCB colours for data only, light/dark,
  checked at 1280/1536/1920 px), site structure (/ landing, /dashboard,
  sign-in, profile, risk, history, models), landing page and dashboard
  sections, content rules, and the deferred live-2026-data item.
- docs/design/: approved mockups (landing page and dashboard) with the
  forecast data they use.
- CLAUDE.md decisions log and the progress report updated. No app code yet.

Co-Authored-By: Claude Opus 5.5 <noreply@anthropic.com>
</commit_message>
<xml_diff>
--- a/docs/Project_Progress.docx
+++ b/docs/Project_Progress.docx
@@ -47,7 +47,7 @@
           <w:sz w:val="18"/>
           <w:szCs w:val="18"/>
         </w:rPr>
-        <w:t xml:space="preserve">Last updated: 26 September 2026    |    Latest commit: Supabase accounts: profile, prediction history (26 Sep 2026)</w:t>
+        <w:t xml:space="preserve">Last updated: 26 September 2026    |    Latest commit: 836d8f7 Supabase accounts; design docs pending commit</w:t>
       </w:r>
     </w:p>
     <w:p>
@@ -845,24 +845,24 @@
               <w:bottom w:val="single" w:color="BFBFBF" w:sz="4"/>
               <w:right w:val="single" w:color="BFBFBF" w:sz="4"/>
             </w:tcBorders>
-            <w:shd w:fill="FFF2CC" w:color="auto" w:val="clear"/>
-            <w:tcMar>
-              <w:top w:type="dxa" w:w="60"/>
-              <w:left w:type="dxa" w:w="100"/>
-              <w:bottom w:type="dxa" w:w="60"/>
-              <w:right w:type="dxa" w:w="100"/>
-            </w:tcMar>
-          </w:tcPr>
-          <w:p>
-            <w:r>
-              <w:rPr>
-                <w:rFonts w:ascii="Calibri" w:cs="Calibri" w:eastAsia="Calibri" w:hAnsi="Calibri"/>
-                <w:b w:val="false"/>
-                <w:bCs w:val="false"/>
-                <w:sz w:val="19"/>
-                <w:szCs w:val="19"/>
-              </w:rPr>
-              <w:t xml:space="preserve">Waiting on you</w:t>
+            <w:shd w:fill="E2EFDA" w:color="auto" w:val="clear"/>
+            <w:tcMar>
+              <w:top w:type="dxa" w:w="60"/>
+              <w:left w:type="dxa" w:w="100"/>
+              <w:bottom w:type="dxa" w:w="60"/>
+              <w:right w:type="dxa" w:w="100"/>
+            </w:tcMar>
+          </w:tcPr>
+          <w:p>
+            <w:r>
+              <w:rPr>
+                <w:rFonts w:ascii="Calibri" w:cs="Calibri" w:eastAsia="Calibri" w:hAnsi="Calibri"/>
+                <w:b w:val="false"/>
+                <w:bCs w:val="false"/>
+                <w:sz w:val="19"/>
+                <w:szCs w:val="19"/>
+              </w:rPr>
+              <w:t xml:space="preserve">Done</w:t>
             </w:r>
           </w:p>
         </w:tc>
@@ -891,7 +891,7 @@
                 <w:sz w:val="19"/>
                 <w:szCs w:val="19"/>
               </w:rPr>
-              <w:t xml:space="preserve">Run scripts/check_accounts_live.py (about 2 minutes)</w:t>
+              <w:t xml:space="preserve">All 8 checks passed against the real Supabase project</w:t>
             </w:r>
           </w:p>
         </w:tc>
@@ -922,6 +922,96 @@
                 <w:sz w:val="19"/>
                 <w:szCs w:val="19"/>
               </w:rPr>
+              <w:t xml:space="preserve">Frontend design (Airware)</w:t>
+            </w:r>
+          </w:p>
+        </w:tc>
+        <w:tc>
+          <w:tcPr>
+            <w:tcW w:type="dxa" w:w="1600"/>
+            <w:tcBorders>
+              <w:top w:val="single" w:color="BFBFBF" w:sz="4"/>
+              <w:left w:val="single" w:color="BFBFBF" w:sz="4"/>
+              <w:bottom w:val="single" w:color="BFBFBF" w:sz="4"/>
+              <w:right w:val="single" w:color="BFBFBF" w:sz="4"/>
+            </w:tcBorders>
+            <w:shd w:fill="E2EFDA" w:color="auto" w:val="clear"/>
+            <w:tcMar>
+              <w:top w:type="dxa" w:w="60"/>
+              <w:left w:type="dxa" w:w="100"/>
+              <w:bottom w:type="dxa" w:w="60"/>
+              <w:right w:type="dxa" w:w="100"/>
+            </w:tcMar>
+          </w:tcPr>
+          <w:p>
+            <w:r>
+              <w:rPr>
+                <w:rFonts w:ascii="Calibri" w:cs="Calibri" w:eastAsia="Calibri" w:hAnsi="Calibri"/>
+                <w:b w:val="false"/>
+                <w:bCs w:val="false"/>
+                <w:sz w:val="19"/>
+                <w:szCs w:val="19"/>
+              </w:rPr>
+              <w:t xml:space="preserve">Done</w:t>
+            </w:r>
+          </w:p>
+        </w:tc>
+        <w:tc>
+          <w:tcPr>
+            <w:tcW w:type="dxa" w:w="4638"/>
+            <w:tcBorders>
+              <w:top w:val="single" w:color="BFBFBF" w:sz="4"/>
+              <w:left w:val="single" w:color="BFBFBF" w:sz="4"/>
+              <w:bottom w:val="single" w:color="BFBFBF" w:sz="4"/>
+              <w:right w:val="single" w:color="BFBFBF" w:sz="4"/>
+            </w:tcBorders>
+            <w:tcMar>
+              <w:top w:type="dxa" w:w="60"/>
+              <w:left w:type="dxa" w:w="100"/>
+              <w:bottom w:type="dxa" w:w="60"/>
+              <w:right w:type="dxa" w:w="100"/>
+            </w:tcMar>
+          </w:tcPr>
+          <w:p>
+            <w:r>
+              <w:rPr>
+                <w:rFonts w:ascii="Calibri" w:cs="Calibri" w:eastAsia="Calibri" w:hAnsi="Calibri"/>
+                <w:b w:val="false"/>
+                <w:bCs w:val="false"/>
+                <w:sz w:val="19"/>
+                <w:szCs w:val="19"/>
+              </w:rPr>
+              <w:t xml:space="preserve">Landing page and dashboard designs approved; spec in docs/frontend_design.md</w:t>
+            </w:r>
+          </w:p>
+        </w:tc>
+      </w:tr>
+      <w:tr>
+        <w:tc>
+          <w:tcPr>
+            <w:tcW w:type="dxa" w:w="3400"/>
+            <w:tcBorders>
+              <w:top w:val="single" w:color="BFBFBF" w:sz="4"/>
+              <w:left w:val="single" w:color="BFBFBF" w:sz="4"/>
+              <w:bottom w:val="single" w:color="BFBFBF" w:sz="4"/>
+              <w:right w:val="single" w:color="BFBFBF" w:sz="4"/>
+            </w:tcBorders>
+            <w:tcMar>
+              <w:top w:type="dxa" w:w="60"/>
+              <w:left w:type="dxa" w:w="100"/>
+              <w:bottom w:type="dxa" w:w="60"/>
+              <w:right w:type="dxa" w:w="100"/>
+            </w:tcMar>
+          </w:tcPr>
+          <w:p>
+            <w:r>
+              <w:rPr>
+                <w:rFonts w:ascii="Calibri" w:cs="Calibri" w:eastAsia="Calibri" w:hAnsi="Calibri"/>
+                <w:b w:val="false"/>
+                <w:bCs w:val="false"/>
+                <w:sz w:val="19"/>
+                <w:szCs w:val="19"/>
+              </w:rPr>
               <w:t xml:space="preserve">Next.js frontend</w:t>
             </w:r>
           </w:p>
@@ -981,7 +1071,7 @@
                 <w:sz w:val="19"/>
                 <w:szCs w:val="19"/>
               </w:rPr>
-              <w:t xml:space="preserve"/>
+              <w:t xml:space="preserve">Waiting for your go-ahead to start coding</w:t>
             </w:r>
           </w:p>
         </w:tc>
@@ -1461,7 +1551,7 @@
         <w:rPr>
           <w:rFonts w:ascii="Calibri" w:cs="Calibri" w:eastAsia="Calibri" w:hAnsi="Calibri"/>
         </w:rPr>
-        <w:t xml:space="preserve">Run git push to upload the latest commits to GitHub.</w:t>
+        <w:t xml:space="preserve">Tell me when to start coding the frontend (design is approved).</w:t>
       </w:r>
     </w:p>
     <w:p>
@@ -1477,7 +1567,29 @@
         <w:rPr>
           <w:rFonts w:ascii="Calibri" w:cs="Calibri" w:eastAsia="Calibri" w:hAnsi="Calibri"/>
         </w:rPr>
-        <w:t xml:space="preserve">In Supabase: Authentication &gt; Users &gt; Add user &gt; Create new user (tick Auto Confirm User) to make a test account.</w:t>
+        <w:t xml:space="preserve">Optional: confirm the small frontend choices (frontend/ folder in this repo, npm, react-leaflet for the map).</w:t>
+      </w:r>
+    </w:p>
+    <w:p>
+      <w:pPr>
+        <w:pStyle w:val="Heading1"/>
+      </w:pPr>
+      <w:r>
+        <w:rPr>
+          <w:rFonts w:ascii="Calibri" w:cs="Calibri" w:eastAsia="Calibri" w:hAnsi="Calibri"/>
+        </w:rPr>
+        <w:t xml:space="preserve">3. Work completed</w:t>
+      </w:r>
+    </w:p>
+    <w:p>
+      <w:pPr>
+        <w:pStyle w:val="Heading2"/>
+      </w:pPr>
+      <w:r>
+        <w:rPr>
+          <w:rFonts w:ascii="Calibri" w:cs="Calibri" w:eastAsia="Calibri" w:hAnsi="Calibri"/>
+        </w:rPr>
+        <w:t xml:space="preserve">AQI forecasting pipeline</w:t>
       </w:r>
     </w:p>
     <w:p>
@@ -1493,29 +1605,7 @@
         <w:rPr>
           <w:rFonts w:ascii="Calibri" w:cs="Calibri" w:eastAsia="Calibri" w:hAnsi="Calibri"/>
         </w:rPr>
-        <w:t xml:space="preserve">With the project venv active, run: python scripts/check_accounts_live.py, then type the test user's email and password when asked.</w:t>
-      </w:r>
-    </w:p>
-    <w:p>
-      <w:pPr>
-        <w:pStyle w:val="Heading1"/>
-      </w:pPr>
-      <w:r>
-        <w:rPr>
-          <w:rFonts w:ascii="Calibri" w:cs="Calibri" w:eastAsia="Calibri" w:hAnsi="Calibri"/>
-        </w:rPr>
-        <w:t xml:space="preserve">3. Work completed</w:t>
-      </w:r>
-    </w:p>
-    <w:p>
-      <w:pPr>
-        <w:pStyle w:val="Heading2"/>
-      </w:pPr>
-      <w:r>
-        <w:rPr>
-          <w:rFonts w:ascii="Calibri" w:cs="Calibri" w:eastAsia="Calibri" w:hAnsi="Calibri"/>
-        </w:rPr>
-        <w:t xml:space="preserve">AQI forecasting pipeline</w:t>
+        <w:t xml:space="preserve">Data loading for Delhi, Bengaluru, Chennai, Hyderabad, Lucknow and Ahmedabad (CPCB data, 2015-2020); gaps up to 21 days interpolated.</w:t>
       </w:r>
     </w:p>
     <w:p>
@@ -1531,7 +1621,7 @@
         <w:rPr>
           <w:rFonts w:ascii="Calibri" w:cs="Calibri" w:eastAsia="Calibri" w:hAnsi="Calibri"/>
         </w:rPr>
-        <w:t xml:space="preserve">Data loading for Delhi, Bengaluru, Chennai, Hyderabad, Lucknow and Ahmedabad (CPCB data, 2015-2020); gaps up to 21 days interpolated.</w:t>
+        <w:t xml:space="preserve">Diagnostics: ADF and KPSS stationarity tests (no differencing needed), seasonal period confirmed at ~365 days (ACF peaks at lags 363-370, STL seasonal strength).</w:t>
       </w:r>
     </w:p>
     <w:p>
@@ -1547,7 +1637,7 @@
         <w:rPr>
           <w:rFonts w:ascii="Calibri" w:cs="Calibri" w:eastAsia="Calibri" w:hAnsi="Calibri"/>
         </w:rPr>
-        <w:t xml:space="preserve">Diagnostics: ADF and KPSS stationarity tests (no differencing needed), seasonal period confirmed at ~365 days (ACF peaks at lags 363-370, STL seasonal strength).</w:t>
+        <w:t xml:space="preserve">Models: ARIMA, SARIMA (weekly + annual Fourier terms), Holt-Winters, LSTM, XGBoost on lag features, Prophet; compared with three naive baselines.</w:t>
       </w:r>
     </w:p>
     <w:p>
@@ -1563,7 +1653,7 @@
         <w:rPr>
           <w:rFonts w:ascii="Calibri" w:cs="Calibri" w:eastAsia="Calibri" w:hAnsi="Calibri"/>
         </w:rPr>
-        <w:t xml:space="preserve">Models: ARIMA, SARIMA (weekly + annual Fourier terms), Holt-Winters, LSTM, XGBoost on lag features, Prophet; compared with three naive baselines.</w:t>
+        <w:t xml:space="preserve">Evaluation on 6 non-overlapping 30-day test windows per city (RMSE, MSE, MAE, MAPE); winner = lowest mean RMSE.</w:t>
       </w:r>
     </w:p>
     <w:p>
@@ -1579,7 +1669,7 @@
         <w:rPr>
           <w:rFonts w:ascii="Calibri" w:cs="Calibri" w:eastAsia="Calibri" w:hAnsi="Calibri"/>
         </w:rPr>
-        <w:t xml:space="preserve">Evaluation on 6 non-overlapping 30-day test windows per city (RMSE, MSE, MAE, MAPE); winner = lowest mean RMSE.</w:t>
+        <w:t xml:space="preserve">Ahmedabad fix: its CO sensor readings were faulty (median 16 mg/m3 vs about 1 elsewhere, AQI up to 2,049), so its AQI is recomputed from hourly data without CO. The method reproduces the published values exactly when CO is included.</w:t>
       </w:r>
     </w:p>
     <w:p>
@@ -1595,7 +1685,18 @@
         <w:rPr>
           <w:rFonts w:ascii="Calibri" w:cs="Calibri" w:eastAsia="Calibri" w:hAnsi="Calibri"/>
         </w:rPr>
-        <w:t xml:space="preserve">Ahmedabad fix: its CO sensor readings were faulty (median 16 mg/m3 vs about 1 elsewhere, AQI up to 2,049), so its AQI is recomputed from hourly data without CO. The method reproduces the published values exactly when CO is included.</w:t>
+        <w:t xml:space="preserve">LSTM results averaged over seeds 42, 43 and 44 (a single seed gave a misleadingly good Delhi result).</w:t>
+      </w:r>
+    </w:p>
+    <w:p>
+      <w:pPr>
+        <w:pStyle w:val="Heading2"/>
+      </w:pPr>
+      <w:r>
+        <w:rPr>
+          <w:rFonts w:ascii="Calibri" w:cs="Calibri" w:eastAsia="Calibri" w:hAnsi="Calibri"/>
+        </w:rPr>
+        <w:t xml:space="preserve">Pollutant forecasting (PM2.5, NO2)</w:t>
       </w:r>
     </w:p>
     <w:p>
@@ -1611,18 +1712,7 @@
         <w:rPr>
           <w:rFonts w:ascii="Calibri" w:cs="Calibri" w:eastAsia="Calibri" w:hAnsi="Calibri"/>
         </w:rPr>
-        <w:t xml:space="preserve">LSTM results averaged over seeds 42, 43 and 44 (a single seed gave a misleadingly good Delhi result).</w:t>
-      </w:r>
-    </w:p>
-    <w:p>
-      <w:pPr>
-        <w:pStyle w:val="Heading2"/>
-      </w:pPr>
-      <w:r>
-        <w:rPr>
-          <w:rFonts w:ascii="Calibri" w:cs="Calibri" w:eastAsia="Calibri" w:hAnsi="Calibri"/>
-        </w:rPr>
-        <w:t xml:space="preserve">Pollutant forecasting (PM2.5, NO2)</w:t>
+        <w:t xml:space="preserve">Same evaluation for PM2.5 and NO2, the only pollutants with usable history in all six cities.</w:t>
       </w:r>
     </w:p>
     <w:p>
@@ -1638,7 +1728,18 @@
         <w:rPr>
           <w:rFonts w:ascii="Calibri" w:cs="Calibri" w:eastAsia="Calibri" w:hAnsi="Calibri"/>
         </w:rPr>
-        <w:t xml:space="preserve">Same evaluation for PM2.5 and NO2, the only pollutants with usable history in all six cities.</w:t>
+        <w:t xml:space="preserve">Where no model beats the naive forecast on mean RMSE, the naive forecast itself is deployed (Hyderabad PM2.5, Ahmedabad NO2).</w:t>
+      </w:r>
+    </w:p>
+    <w:p>
+      <w:pPr>
+        <w:pStyle w:val="Heading2"/>
+      </w:pPr>
+      <w:r>
+        <w:rPr>
+          <w:rFonts w:ascii="Calibri" w:cs="Calibri" w:eastAsia="Calibri" w:hAnsi="Calibri"/>
+        </w:rPr>
+        <w:t xml:space="preserve">Saved forecasting models</w:t>
       </w:r>
     </w:p>
     <w:p>
@@ -1654,18 +1755,7 @@
         <w:rPr>
           <w:rFonts w:ascii="Calibri" w:cs="Calibri" w:eastAsia="Calibri" w:hAnsi="Calibri"/>
         </w:rPr>
-        <w:t xml:space="preserve">Where no model beats the naive forecast on mean RMSE, the naive forecast itself is deployed (Hyderabad PM2.5, Ahmedabad NO2).</w:t>
-      </w:r>
-    </w:p>
-    <w:p>
-      <w:pPr>
-        <w:pStyle w:val="Heading2"/>
-      </w:pPr>
-      <w:r>
-        <w:rPr>
-          <w:rFonts w:ascii="Calibri" w:cs="Calibri" w:eastAsia="Calibri" w:hAnsi="Calibri"/>
-        </w:rPr>
-        <w:t xml:space="preserve">Saved forecasting models</w:t>
+        <w:t xml:space="preserve">Each city's winner retrained on its full history and saved in its native format (joblib, XGBoost .ubj, PyTorch state_dict, Prophet JSON), with metadata and a registry.</w:t>
       </w:r>
     </w:p>
     <w:p>
@@ -1681,7 +1771,18 @@
         <w:rPr>
           <w:rFonts w:ascii="Calibri" w:cs="Calibri" w:eastAsia="Calibri" w:hAnsi="Calibri"/>
         </w:rPr>
-        <w:t xml:space="preserve">Each city's winner retrained on its full history and saved in its native format (joblib, XGBoost .ubj, PyTorch state_dict, Prophet JSON), with metadata and a registry.</w:t>
+        <w:t xml:space="preserve">Verified: reloaded models reproduce the in-memory forecasts exactly.</w:t>
+      </w:r>
+    </w:p>
+    <w:p>
+      <w:pPr>
+        <w:pStyle w:val="Heading2"/>
+      </w:pPr>
+      <w:r>
+        <w:rPr>
+          <w:rFonts w:ascii="Calibri" w:cs="Calibri" w:eastAsia="Calibri" w:hAnsi="Calibri"/>
+        </w:rPr>
+        <w:t xml:space="preserve">Health-risk models</w:t>
       </w:r>
     </w:p>
     <w:p>
@@ -1697,18 +1798,7 @@
         <w:rPr>
           <w:rFonts w:ascii="Calibri" w:cs="Calibri" w:eastAsia="Calibri" w:hAnsi="Calibri"/>
         </w:rPr>
-        <w:t xml:space="preserve">Verified: reloaded models reproduce the in-memory forecasts exactly.</w:t>
-      </w:r>
-    </w:p>
-    <w:p>
-      <w:pPr>
-        <w:pStyle w:val="Heading2"/>
-      </w:pPr>
-      <w:r>
-        <w:rPr>
-          <w:rFonts w:ascii="Calibri" w:cs="Calibri" w:eastAsia="Calibri" w:hAnsi="Calibri"/>
-        </w:rPr>
-        <w:t xml:space="preserve">Health-risk models</w:t>
+        <w:t xml:space="preserve">Random Forest, XGBoost and MLP compared for risk level (weighted F1) and risk score (RMSE), with 5-fold cross-validation and a held-out 20% test set.</w:t>
       </w:r>
     </w:p>
     <w:p>
@@ -1724,7 +1814,7 @@
         <w:rPr>
           <w:rFonts w:ascii="Calibri" w:cs="Calibri" w:eastAsia="Calibri" w:hAnsi="Calibri"/>
         </w:rPr>
-        <w:t xml:space="preserve">Random Forest, XGBoost and MLP compared for risk level (weighted F1) and risk score (RMSE), with 5-fold cross-validation and a held-out 20% test set.</w:t>
+        <w:t xml:space="preserve">MLP selected for both tasks. Primary model uses the profile plus AQI, PM2.5 and NO2; an AQI-only model is the automatic fallback.</w:t>
       </w:r>
     </w:p>
     <w:p>
@@ -1740,7 +1830,7 @@
         <w:rPr>
           <w:rFonts w:ascii="Calibri" w:cs="Calibri" w:eastAsia="Calibri" w:hAnsi="Calibri"/>
         </w:rPr>
-        <w:t xml:space="preserve">MLP selected for both tasks. Primary model uses the profile plus AQI, PM2.5 and NO2; an AQI-only model is the automatic fallback.</w:t>
+        <w:t xml:space="preserve">Boundary rule: the classifier's level is the headline; days where the score implies a neighbouring level are flagged borderline and shown as a range; the higher level drives High/Severe alerts.</w:t>
       </w:r>
     </w:p>
     <w:p>
@@ -1756,7 +1846,18 @@
         <w:rPr>
           <w:rFonts w:ascii="Calibri" w:cs="Calibri" w:eastAsia="Calibri" w:hAnsi="Calibri"/>
         </w:rPr>
-        <w:t xml:space="preserve">Boundary rule: the classifier's level is the headline; days where the score implies a neighbouring level are flagged borderline and shown as a range; the higher level drives High/Severe alerts.</w:t>
+        <w:t xml:space="preserve">Backtest on real historical forecasts: the pollutant model beats the AQI-only model (73.3% vs 68.5% level agreement with the reference).</w:t>
+      </w:r>
+    </w:p>
+    <w:p>
+      <w:pPr>
+        <w:pStyle w:val="Heading2"/>
+      </w:pPr>
+      <w:r>
+        <w:rPr>
+          <w:rFonts w:ascii="Calibri" w:cs="Calibri" w:eastAsia="Calibri" w:hAnsi="Calibri"/>
+        </w:rPr>
+        <w:t xml:space="preserve">FastAPI backend (public part)</w:t>
       </w:r>
     </w:p>
     <w:p>
@@ -1772,18 +1873,7 @@
         <w:rPr>
           <w:rFonts w:ascii="Calibri" w:cs="Calibri" w:eastAsia="Calibri" w:hAnsi="Calibri"/>
         </w:rPr>
-        <w:t xml:space="preserve">Backtest on real historical forecasts: the pollutant model beats the AQI-only model (73.3% vs 68.5% level agreement with the reference).</w:t>
-      </w:r>
-    </w:p>
-    <w:p>
-      <w:pPr>
-        <w:pStyle w:val="Heading2"/>
-      </w:pPr>
-      <w:r>
-        <w:rPr>
-          <w:rFonts w:ascii="Calibri" w:cs="Calibri" w:eastAsia="Calibri" w:hAnsi="Calibri"/>
-        </w:rPr>
-        <w:t xml:space="preserve">FastAPI backend (public part)</w:t>
+        <w:t xml:space="preserve">Endpoints: /api/health, /api/cities, /api/forecast/{city}, /api/risk/predict, /api/profile/schema, /api/leaderboard/forecast, /api/leaderboard/health.</w:t>
       </w:r>
     </w:p>
     <w:p>
@@ -1799,7 +1889,7 @@
         <w:rPr>
           <w:rFonts w:ascii="Calibri" w:cs="Calibri" w:eastAsia="Calibri" w:hAnsi="Calibri"/>
         </w:rPr>
-        <w:t xml:space="preserve">Endpoints: /api/health, /api/cities, /api/forecast/{city}, /api/risk/predict, /api/profile/schema, /api/leaderboard/forecast, /api/leaderboard/health.</w:t>
+        <w:t xml:space="preserve">All models load once at startup (~20 s); requests after that take well under a second.</w:t>
       </w:r>
     </w:p>
     <w:p>
@@ -1815,7 +1905,7 @@
         <w:rPr>
           <w:rFonts w:ascii="Calibri" w:cs="Calibri" w:eastAsia="Calibri" w:hAnsi="Calibri"/>
         </w:rPr>
-        <w:t xml:space="preserve">All models load once at startup (~20 s); requests after that take well under a second.</w:t>
+        <w:t xml:space="preserve">Profile validation: occupation, area type, mask usage and outdoor hours are required (defaulting them understated risk); BMI, exercise and family history are optional.</w:t>
       </w:r>
     </w:p>
     <w:p>
@@ -1831,7 +1921,18 @@
         <w:rPr>
           <w:rFonts w:ascii="Calibri" w:cs="Calibri" w:eastAsia="Calibri" w:hAnsi="Calibri"/>
         </w:rPr>
-        <w:t xml:space="preserve">Profile validation: occupation, area type, mask usage and outdoor hours are required (defaulting them understated risk); BMI, exercise and family history are optional.</w:t>
+        <w:t xml:space="preserve">29 automated tests pass.</w:t>
+      </w:r>
+    </w:p>
+    <w:p>
+      <w:pPr>
+        <w:pStyle w:val="Heading2"/>
+      </w:pPr>
+      <w:r>
+        <w:rPr>
+          <w:rFonts w:ascii="Calibri" w:cs="Calibri" w:eastAsia="Calibri" w:hAnsi="Calibri"/>
+        </w:rPr>
+        <w:t xml:space="preserve">Supabase and user accounts</w:t>
       </w:r>
     </w:p>
     <w:p>
@@ -1847,18 +1948,7 @@
         <w:rPr>
           <w:rFonts w:ascii="Calibri" w:cs="Calibri" w:eastAsia="Calibri" w:hAnsi="Calibri"/>
         </w:rPr>
-        <w:t xml:space="preserve">29 automated tests pass.</w:t>
-      </w:r>
-    </w:p>
-    <w:p>
-      <w:pPr>
-        <w:pStyle w:val="Heading2"/>
-      </w:pPr>
-      <w:r>
-        <w:rPr>
-          <w:rFonts w:ascii="Calibri" w:cs="Calibri" w:eastAsia="Calibri" w:hAnsi="Calibri"/>
-        </w:rPr>
-        <w:t xml:space="preserve">Supabase and user accounts</w:t>
+        <w:t xml:space="preserve">Supabase project created (Mumbai region); database script run; checks confirmed public tables are readable, private tables are blocked without sign-in, and the public key can't write.</w:t>
       </w:r>
     </w:p>
     <w:p>
@@ -1874,7 +1964,7 @@
         <w:rPr>
           <w:rFonts w:ascii="Calibri" w:cs="Calibri" w:eastAsia="Calibri" w:hAnsi="Calibri"/>
         </w:rPr>
-        <w:t xml:space="preserve">Supabase project created (Mumbai region); database script run; checks confirmed public tables are readable, private tables are blocked without sign-in, and the public key can't write.</w:t>
+        <w:t xml:space="preserve">Signed-in endpoints: GET/PUT /api/me/profile, POST /api/me/risk (runs a prediction with the saved profile and saves it to history), GET /api/me/history, GET/DELETE /api/me/history/{id}.</w:t>
       </w:r>
     </w:p>
     <w:p>
@@ -1890,7 +1980,7 @@
         <w:rPr>
           <w:rFonts w:ascii="Calibri" w:cs="Calibri" w:eastAsia="Calibri" w:hAnsi="Calibri"/>
         </w:rPr>
-        <w:t xml:space="preserve">Signed-in endpoints: GET/PUT /api/me/profile, POST /api/me/risk (runs a prediction with the saved profile and saves it to history), GET /api/me/history, GET/DELETE /api/me/history/{id}.</w:t>
+        <w:t xml:space="preserve">Each database call is made with the user's own sign-in token, so row-level security keeps every user's profile and history private, even inside the backend.</w:t>
       </w:r>
     </w:p>
     <w:p>
@@ -1906,7 +1996,7 @@
         <w:rPr>
           <w:rFonts w:ascii="Calibri" w:cs="Calibri" w:eastAsia="Calibri" w:hAnsi="Calibri"/>
         </w:rPr>
-        <w:t xml:space="preserve">Each database call is made with the user's own sign-in token, so row-level security keeps every user's profile and history private, even inside the backend.</w:t>
+        <w:t xml:space="preserve">12 new tests using an in-memory stand-in for Supabase that enforces the same per-user rules (41 tests pass in total); the real sign-in service correctly rejects invalid tokens.</w:t>
       </w:r>
     </w:p>
     <w:p>
@@ -1922,7 +2012,7 @@
         <w:rPr>
           <w:rFonts w:ascii="Calibri" w:cs="Calibri" w:eastAsia="Calibri" w:hAnsi="Calibri"/>
         </w:rPr>
-        <w:t xml:space="preserve">12 new tests using an in-memory stand-in for Supabase that enforces the same per-user rules (41 tests pass in total); the real sign-in service correctly rejects invalid tokens.</w:t>
+        <w:t xml:space="preserve">Live end-to-end check with a real test user passed all 8 steps: save and read profile, run a prediction, list and read history, hidden without sign-in, delete, confirm deletion.</w:t>
       </w:r>
     </w:p>
     <w:p>
@@ -1971,6 +2061,129 @@
           <w:rFonts w:ascii="Calibri" w:cs="Calibri" w:eastAsia="Calibri" w:hAnsi="Calibri"/>
         </w:rPr>
         <w:t xml:space="preserve">Step-by-step setup guide (supabase/README.md) and .env.example; real keys stay in a git-ignored .env.</w:t>
+      </w:r>
+    </w:p>
+    <w:p>
+      <w:pPr>
+        <w:pStyle w:val="Heading2"/>
+      </w:pPr>
+      <w:r>
+        <w:rPr>
+          <w:rFonts w:ascii="Calibri" w:cs="Calibri" w:eastAsia="Calibri" w:hAnsi="Calibri"/>
+        </w:rPr>
+        <w:t xml:space="preserve">Frontend design (Airware)</w:t>
+      </w:r>
+    </w:p>
+    <w:p>
+      <w:pPr>
+        <w:pStyle w:val="ListParagraph"/>
+        <w:numPr>
+          <w:ilvl w:val="0"/>
+          <w:numId w:val="2"/>
+        </w:numPr>
+        <w:spacing w:after="60"/>
+      </w:pPr>
+      <w:r>
+        <w:rPr>
+          <w:rFonts w:ascii="Calibri" w:cs="Calibri" w:eastAsia="Calibri" w:hAnsi="Calibri"/>
+        </w:rPr>
+        <w:t xml:space="preserve">Site named Airware. Stack confirmed: Next.js, React + TypeScript, Tailwind CSS, shadcn/ui, Motion, ECharts, Lucide React, Leaflet + OpenStreetMap, Overpass API.</w:t>
+      </w:r>
+    </w:p>
+    <w:p>
+      <w:pPr>
+        <w:pStyle w:val="ListParagraph"/>
+        <w:numPr>
+          <w:ilvl w:val="0"/>
+          <w:numId w:val="2"/>
+        </w:numPr>
+        <w:spacing w:after="60"/>
+      </w:pPr>
+      <w:r>
+        <w:rPr>
+          <w:rFonts w:ascii="Calibri" w:cs="Calibri" w:eastAsia="Calibri" w:hAnsi="Calibri"/>
+        </w:rPr>
+        <w:t xml:space="preserve">Design direction: a data-first dashboard (like IQAir or Windy) using the full screen width, with IBM Plex fonts, neutral colours, one deep-teal brand colour, and the official CPCB colours reserved for air-quality data.</w:t>
+      </w:r>
+    </w:p>
+    <w:p>
+      <w:pPr>
+        <w:pStyle w:val="ListParagraph"/>
+        <w:numPr>
+          <w:ilvl w:val="0"/>
+          <w:numId w:val="2"/>
+        </w:numPr>
+        <w:spacing w:after="60"/>
+      </w:pPr>
+      <w:r>
+        <w:rPr>
+          <w:rFonts w:ascii="Calibri" w:cs="Calibri" w:eastAsia="Calibri" w:hAnsi="Calibri"/>
+        </w:rPr>
+        <w:t xml:space="preserve">Approved overview page: city tabs, tomorrow's AQI with the CPCB scale and health advice, interactive forecast chart, pollutants, day-by-day health risk, precautions, and an all-cities comparison table.</w:t>
+      </w:r>
+    </w:p>
+    <w:p>
+      <w:pPr>
+        <w:pStyle w:val="ListParagraph"/>
+        <w:numPr>
+          <w:ilvl w:val="0"/>
+          <w:numId w:val="2"/>
+        </w:numPr>
+        <w:spacing w:after="60"/>
+      </w:pPr>
+      <w:r>
+        <w:rPr>
+          <w:rFonts w:ascii="Calibri" w:cs="Calibri" w:eastAsia="Calibri" w:hAnsi="Calibri"/>
+        </w:rPr>
+        <w:t xml:space="preserve">Approved landing page: hero with a live dashboard preview, city AQI strip, a two-person example showing why personal risk matters, how it works, features, model results, data and AQI scale, privacy, FAQ and footer.</w:t>
+      </w:r>
+    </w:p>
+    <w:p>
+      <w:pPr>
+        <w:pStyle w:val="ListParagraph"/>
+        <w:numPr>
+          <w:ilvl w:val="0"/>
+          <w:numId w:val="2"/>
+        </w:numPr>
+        <w:spacing w:after="60"/>
+      </w:pPr>
+      <w:r>
+        <w:rPr>
+          <w:rFonts w:ascii="Calibri" w:cs="Calibri" w:eastAsia="Calibri" w:hAnsi="Calibri"/>
+        </w:rPr>
+        <w:t xml:space="preserve">Site structure: landing page at /, dashboard at /dashboard, plus sign-in, profile wizard, my risk, history and models pages.</w:t>
+      </w:r>
+    </w:p>
+    <w:p>
+      <w:pPr>
+        <w:pStyle w:val="ListParagraph"/>
+        <w:numPr>
+          <w:ilvl w:val="0"/>
+          <w:numId w:val="2"/>
+        </w:numPr>
+        <w:spacing w:after="60"/>
+      </w:pPr>
+      <w:r>
+        <w:rPr>
+          <w:rFonts w:ascii="Calibri" w:cs="Calibri" w:eastAsia="Calibri" w:hAnsi="Calibri"/>
+        </w:rPr>
+        <w:t xml:space="preserve">Light and dark themes with a toggle; layout checked at 1280, 1536 and 1920 px wide (the user's laptop at 150%, 125% and 100% scaling).</w:t>
+      </w:r>
+    </w:p>
+    <w:p>
+      <w:pPr>
+        <w:pStyle w:val="ListParagraph"/>
+        <w:numPr>
+          <w:ilvl w:val="0"/>
+          <w:numId w:val="2"/>
+        </w:numPr>
+        <w:spacing w:after="60"/>
+      </w:pPr>
+      <w:r>
+        <w:rPr>
+          <w:rFonts w:ascii="Calibri" w:cs="Calibri" w:eastAsia="Calibri" w:hAnsi="Calibri"/>
+        </w:rPr>
+        <w:t xml:space="preserve">Spec saved in docs/frontend_design.md with the approved preview in docs/design/.</w:t>
       </w:r>
     </w:p>
     <w:p>
@@ -4470,7 +4683,7 @@
                 <w:sz w:val="19"/>
                 <w:szCs w:val="19"/>
               </w:rPr>
-              <w:t xml:space="preserve">Live accounts check with a real test user</w:t>
+              <w:t xml:space="preserve">Next.js frontend</w:t>
             </w:r>
           </w:p>
         </w:tc>
@@ -4499,7 +4712,7 @@
                 <w:sz w:val="19"/>
                 <w:szCs w:val="19"/>
               </w:rPr>
-              <w:t xml:space="preserve">You</w:t>
+              <w:t xml:space="preserve">Backend</w:t>
             </w:r>
           </w:p>
         </w:tc>
@@ -4528,7 +4741,7 @@
                 <w:sz w:val="19"/>
                 <w:szCs w:val="19"/>
               </w:rPr>
-              <w:t xml:space="preserve">Create a test user in the dashboard (Auto Confirm) and run scripts/check_accounts_live.py</w:t>
+              <w:t xml:space="preserve">City forecast charts, one-time profile form, day-by-day risk view, history, leaderboard, disclaimer</w:t>
             </w:r>
           </w:p>
         </w:tc>
@@ -4559,7 +4772,7 @@
                 <w:sz w:val="19"/>
                 <w:szCs w:val="19"/>
               </w:rPr>
-              <w:t xml:space="preserve">Next.js frontend</w:t>
+              <w:t xml:space="preserve">Hospital map</w:t>
             </w:r>
           </w:p>
         </w:tc>
@@ -4588,7 +4801,7 @@
                 <w:sz w:val="19"/>
                 <w:szCs w:val="19"/>
               </w:rPr>
-              <w:t xml:space="preserve">Backend</w:t>
+              <w:t xml:space="preserve">Frontend</w:t>
             </w:r>
           </w:p>
         </w:tc>
@@ -4617,7 +4830,7 @@
                 <w:sz w:val="19"/>
                 <w:szCs w:val="19"/>
               </w:rPr>
-              <w:t xml:space="preserve">City forecast charts, one-time profile form, day-by-day risk view, history, leaderboard, disclaimer</w:t>
+              <w:t xml:space="preserve">Shown when the alert level is High/Severe; contact details only, no booking</w:t>
             </w:r>
           </w:p>
         </w:tc>
@@ -4648,7 +4861,7 @@
                 <w:sz w:val="19"/>
                 <w:szCs w:val="19"/>
               </w:rPr>
-              <w:t xml:space="preserve">Hospital map</w:t>
+              <w:t xml:space="preserve">Recommendation assistant</w:t>
             </w:r>
           </w:p>
         </w:tc>
@@ -4706,7 +4919,7 @@
                 <w:sz w:val="19"/>
                 <w:szCs w:val="19"/>
               </w:rPr>
-              <w:t xml:space="preserve">Shown when the alert level is High/Severe; contact details only, no booking</w:t>
+              <w:t xml:space="preserve">Keyword matching + curated precautions, personalised with AQI and risk</w:t>
             </w:r>
           </w:p>
         </w:tc>
@@ -4737,7 +4950,7 @@
                 <w:sz w:val="19"/>
                 <w:szCs w:val="19"/>
               </w:rPr>
-              <w:t xml:space="preserve">Recommendation assistant</w:t>
+              <w:t xml:space="preserve">Live 2026 data</w:t>
             </w:r>
           </w:p>
         </w:tc>
@@ -4766,7 +4979,7 @@
                 <w:sz w:val="19"/>
                 <w:szCs w:val="19"/>
               </w:rPr>
-              <w:t xml:space="preserve">Frontend</w:t>
+              <w:t xml:space="preserve">After the frontend</w:t>
             </w:r>
           </w:p>
         </w:tc>
@@ -4795,7 +5008,7 @@
                 <w:sz w:val="19"/>
                 <w:szCs w:val="19"/>
               </w:rPr>
-              <w:t xml:space="preserve">Keyword matching + curated precautions, personalised with AQI and risk</w:t>
+              <w:t xml:space="preserve">Show today's AQI and forecast from today using recent station data; needs a free OpenAQ API key</w:t>
             </w:r>
           </w:p>
         </w:tc>
@@ -5217,6 +5430,186 @@
                 <w:szCs w:val="19"/>
               </w:rPr>
               <w:t xml:space="preserve">What changed</w:t>
+            </w:r>
+          </w:p>
+        </w:tc>
+      </w:tr>
+      <w:tr>
+        <w:tc>
+          <w:tcPr>
+            <w:tcW w:type="dxa" w:w="1900"/>
+            <w:tcBorders>
+              <w:top w:val="single" w:color="BFBFBF" w:sz="4"/>
+              <w:left w:val="single" w:color="BFBFBF" w:sz="4"/>
+              <w:bottom w:val="single" w:color="BFBFBF" w:sz="4"/>
+              <w:right w:val="single" w:color="BFBFBF" w:sz="4"/>
+            </w:tcBorders>
+            <w:tcMar>
+              <w:top w:type="dxa" w:w="60"/>
+              <w:left w:type="dxa" w:w="100"/>
+              <w:bottom w:type="dxa" w:w="60"/>
+              <w:right w:type="dxa" w:w="100"/>
+            </w:tcMar>
+          </w:tcPr>
+          <w:p>
+            <w:r>
+              <w:rPr>
+                <w:rFonts w:ascii="Calibri" w:cs="Calibri" w:eastAsia="Calibri" w:hAnsi="Calibri"/>
+                <w:b w:val="false"/>
+                <w:bCs w:val="false"/>
+                <w:sz w:val="19"/>
+                <w:szCs w:val="19"/>
+              </w:rPr>
+              <w:t xml:space="preserve">26 Sep 2026</w:t>
+            </w:r>
+          </w:p>
+        </w:tc>
+        <w:tc>
+          <w:tcPr>
+            <w:tcW w:type="dxa" w:w="7738"/>
+            <w:tcBorders>
+              <w:top w:val="single" w:color="BFBFBF" w:sz="4"/>
+              <w:left w:val="single" w:color="BFBFBF" w:sz="4"/>
+              <w:bottom w:val="single" w:color="BFBFBF" w:sz="4"/>
+              <w:right w:val="single" w:color="BFBFBF" w:sz="4"/>
+            </w:tcBorders>
+            <w:tcMar>
+              <w:top w:type="dxa" w:w="60"/>
+              <w:left w:type="dxa" w:w="100"/>
+              <w:bottom w:type="dxa" w:w="60"/>
+              <w:right w:type="dxa" w:w="100"/>
+            </w:tcMar>
+          </w:tcPr>
+          <w:p>
+            <w:r>
+              <w:rPr>
+                <w:rFonts w:ascii="Calibri" w:cs="Calibri" w:eastAsia="Calibri" w:hAnsi="Calibri"/>
+                <w:b w:val="false"/>
+                <w:bCs w:val="false"/>
+                <w:sz w:val="19"/>
+                <w:szCs w:val="19"/>
+              </w:rPr>
+              <w:t xml:space="preserve">Landing page design approved and saved; site structure set; live 2026 data scheduled after the frontend.</w:t>
+            </w:r>
+          </w:p>
+        </w:tc>
+      </w:tr>
+      <w:tr>
+        <w:tc>
+          <w:tcPr>
+            <w:tcW w:type="dxa" w:w="1900"/>
+            <w:tcBorders>
+              <w:top w:val="single" w:color="BFBFBF" w:sz="4"/>
+              <w:left w:val="single" w:color="BFBFBF" w:sz="4"/>
+              <w:bottom w:val="single" w:color="BFBFBF" w:sz="4"/>
+              <w:right w:val="single" w:color="BFBFBF" w:sz="4"/>
+            </w:tcBorders>
+            <w:tcMar>
+              <w:top w:type="dxa" w:w="60"/>
+              <w:left w:type="dxa" w:w="100"/>
+              <w:bottom w:type="dxa" w:w="60"/>
+              <w:right w:type="dxa" w:w="100"/>
+            </w:tcMar>
+          </w:tcPr>
+          <w:p>
+            <w:r>
+              <w:rPr>
+                <w:rFonts w:ascii="Calibri" w:cs="Calibri" w:eastAsia="Calibri" w:hAnsi="Calibri"/>
+                <w:b w:val="false"/>
+                <w:bCs w:val="false"/>
+                <w:sz w:val="19"/>
+                <w:szCs w:val="19"/>
+              </w:rPr>
+              <w:t xml:space="preserve">26 Sep 2026</w:t>
+            </w:r>
+          </w:p>
+        </w:tc>
+        <w:tc>
+          <w:tcPr>
+            <w:tcW w:type="dxa" w:w="7738"/>
+            <w:tcBorders>
+              <w:top w:val="single" w:color="BFBFBF" w:sz="4"/>
+              <w:left w:val="single" w:color="BFBFBF" w:sz="4"/>
+              <w:bottom w:val="single" w:color="BFBFBF" w:sz="4"/>
+              <w:right w:val="single" w:color="BFBFBF" w:sz="4"/>
+            </w:tcBorders>
+            <w:tcMar>
+              <w:top w:type="dxa" w:w="60"/>
+              <w:left w:type="dxa" w:w="100"/>
+              <w:bottom w:type="dxa" w:w="60"/>
+              <w:right w:type="dxa" w:w="100"/>
+            </w:tcMar>
+          </w:tcPr>
+          <w:p>
+            <w:r>
+              <w:rPr>
+                <w:rFonts w:ascii="Calibri" w:cs="Calibri" w:eastAsia="Calibri" w:hAnsi="Calibri"/>
+                <w:b w:val="false"/>
+                <w:bCs w:val="false"/>
+                <w:sz w:val="19"/>
+                <w:szCs w:val="19"/>
+              </w:rPr>
+              <w:t xml:space="preserve">Frontend design approved: Airware data-first dashboard, light and dark themes; spec and preview saved.</w:t>
+            </w:r>
+          </w:p>
+        </w:tc>
+      </w:tr>
+      <w:tr>
+        <w:tc>
+          <w:tcPr>
+            <w:tcW w:type="dxa" w:w="1900"/>
+            <w:tcBorders>
+              <w:top w:val="single" w:color="BFBFBF" w:sz="4"/>
+              <w:left w:val="single" w:color="BFBFBF" w:sz="4"/>
+              <w:bottom w:val="single" w:color="BFBFBF" w:sz="4"/>
+              <w:right w:val="single" w:color="BFBFBF" w:sz="4"/>
+            </w:tcBorders>
+            <w:tcMar>
+              <w:top w:type="dxa" w:w="60"/>
+              <w:left w:type="dxa" w:w="100"/>
+              <w:bottom w:type="dxa" w:w="60"/>
+              <w:right w:type="dxa" w:w="100"/>
+            </w:tcMar>
+          </w:tcPr>
+          <w:p>
+            <w:r>
+              <w:rPr>
+                <w:rFonts w:ascii="Calibri" w:cs="Calibri" w:eastAsia="Calibri" w:hAnsi="Calibri"/>
+                <w:b w:val="false"/>
+                <w:bCs w:val="false"/>
+                <w:sz w:val="19"/>
+                <w:szCs w:val="19"/>
+              </w:rPr>
+              <w:t xml:space="preserve">26 Sep 2026</w:t>
+            </w:r>
+          </w:p>
+        </w:tc>
+        <w:tc>
+          <w:tcPr>
+            <w:tcW w:type="dxa" w:w="7738"/>
+            <w:tcBorders>
+              <w:top w:val="single" w:color="BFBFBF" w:sz="4"/>
+              <w:left w:val="single" w:color="BFBFBF" w:sz="4"/>
+              <w:bottom w:val="single" w:color="BFBFBF" w:sz="4"/>
+              <w:right w:val="single" w:color="BFBFBF" w:sz="4"/>
+            </w:tcBorders>
+            <w:tcMar>
+              <w:top w:type="dxa" w:w="60"/>
+              <w:left w:type="dxa" w:w="100"/>
+              <w:bottom w:type="dxa" w:w="60"/>
+              <w:right w:type="dxa" w:w="100"/>
+            </w:tcMar>
+          </w:tcPr>
+          <w:p>
+            <w:r>
+              <w:rPr>
+                <w:rFonts w:ascii="Calibri" w:cs="Calibri" w:eastAsia="Calibri" w:hAnsi="Calibri"/>
+                <w:b w:val="false"/>
+                <w:bCs w:val="false"/>
+                <w:sz w:val="19"/>
+                <w:szCs w:val="19"/>
+              </w:rPr>
+              <w:t xml:space="preserve">Live accounts check passed (8/8) with a real test user; all commits pushed to GitHub.</w:t>
             </w:r>
           </w:p>
         </w:tc>

</xml_diff>

<commit_message>
Frontend: Airware landing page and dashboard; project report; clean dataset
- frontend/: Next.js 16 app (React 19, TypeScript, Tailwind v4, shadcn/ui,
  Motion, ECharts, Lucide) following docs/frontend_design.md. Landing page
  (/) and dashboard (/dashboard?city=&h=) are wired to the live FastAPI API.
  Light/dark theme with a no-flash init script, IBM Plex fonts, CPCB colours
  reserved for data, loading and error states, reduced-motion support.
  Placeholder pages for forecast, risk, history, models and sign-in.
  Layouts checked at 1280, 1536 and 1920 px; wide breakpoint set to 1700 px.
- docs/Project_Report.docx (15 pages, 4 evaluation criteria) with its
  generators (docs/report/build_report.js, make_figures.py).
- data/processed/city_day_clean.csv: cleaned daily AQI, PM2.5 and NO2 for
  the six cities, with interpolation flags.
- Design spec, README, CLAUDE.md decisions log and the progress report
  updated.

Co-Authored-By: Claude Sonnet 5.5 <noreply@anthropic.com>
</commit_message>
<xml_diff>
--- a/docs/Project_Progress.docx
+++ b/docs/Project_Progress.docx
@@ -47,7 +47,7 @@
           <w:sz w:val="18"/>
           <w:szCs w:val="18"/>
         </w:rPr>
-        <w:t xml:space="preserve">Last updated: 26 September 2026    |    Latest commit: 836d8f7 Supabase accounts; design docs pending commit</w:t>
+        <w:t xml:space="preserve">Last updated: 5 October 2026    |    Latest commit: 836d8f7 Supabase accounts; design docs pending commit</w:t>
       </w:r>
     </w:p>
     <w:p>
@@ -1012,7 +1012,7 @@
                 <w:sz w:val="19"/>
                 <w:szCs w:val="19"/>
               </w:rPr>
-              <w:t xml:space="preserve">Next.js frontend</w:t>
+              <w:t xml:space="preserve">Next.js frontend: landing + dashboard</w:t>
             </w:r>
           </w:p>
         </w:tc>
@@ -1025,24 +1025,24 @@
               <w:bottom w:val="single" w:color="BFBFBF" w:sz="4"/>
               <w:right w:val="single" w:color="BFBFBF" w:sz="4"/>
             </w:tcBorders>
-            <w:shd w:fill="F2F2F2" w:color="auto" w:val="clear"/>
-            <w:tcMar>
-              <w:top w:type="dxa" w:w="60"/>
-              <w:left w:type="dxa" w:w="100"/>
-              <w:bottom w:type="dxa" w:w="60"/>
-              <w:right w:type="dxa" w:w="100"/>
-            </w:tcMar>
-          </w:tcPr>
-          <w:p>
-            <w:r>
-              <w:rPr>
-                <w:rFonts w:ascii="Calibri" w:cs="Calibri" w:eastAsia="Calibri" w:hAnsi="Calibri"/>
-                <w:b w:val="false"/>
-                <w:bCs w:val="false"/>
-                <w:sz w:val="19"/>
-                <w:szCs w:val="19"/>
-              </w:rPr>
-              <w:t xml:space="preserve">Not started</w:t>
+            <w:shd w:fill="E2EFDA" w:color="auto" w:val="clear"/>
+            <w:tcMar>
+              <w:top w:type="dxa" w:w="60"/>
+              <w:left w:type="dxa" w:w="100"/>
+              <w:bottom w:type="dxa" w:w="60"/>
+              <w:right w:type="dxa" w:w="100"/>
+            </w:tcMar>
+          </w:tcPr>
+          <w:p>
+            <w:r>
+              <w:rPr>
+                <w:rFonts w:ascii="Calibri" w:cs="Calibri" w:eastAsia="Calibri" w:hAnsi="Calibri"/>
+                <w:b w:val="false"/>
+                <w:bCs w:val="false"/>
+                <w:sz w:val="19"/>
+                <w:szCs w:val="19"/>
+              </w:rPr>
+              <w:t xml:space="preserve">Done</w:t>
             </w:r>
           </w:p>
         </w:tc>
@@ -1071,7 +1071,7 @@
                 <w:sz w:val="19"/>
                 <w:szCs w:val="19"/>
               </w:rPr>
-              <w:t xml:space="preserve">Waiting for your go-ahead to start coding</w:t>
+              <w:t xml:space="preserve">Built and connected to the live API; checked at 1280, 1536 and 1920 px</w:t>
             </w:r>
           </w:p>
         </w:tc>
@@ -1102,7 +1102,7 @@
                 <w:sz w:val="19"/>
                 <w:szCs w:val="19"/>
               </w:rPr>
-              <w:t xml:space="preserve">Hospital map</w:t>
+              <w:t xml:space="preserve">Frontend: sign-in, profile, my risk, history, models</w:t>
             </w:r>
           </w:p>
         </w:tc>
@@ -1161,7 +1161,7 @@
                 <w:sz w:val="19"/>
                 <w:szCs w:val="19"/>
               </w:rPr>
-              <w:t xml:space="preserve">Leaflet + OpenStreetMap (Overpass)</w:t>
+              <w:t xml:space="preserve">Placeholder pages in place; next build step</w:t>
             </w:r>
           </w:p>
         </w:tc>
@@ -1192,7 +1192,7 @@
                 <w:sz w:val="19"/>
                 <w:szCs w:val="19"/>
               </w:rPr>
-              <w:t xml:space="preserve">Recommendation assistant</w:t>
+              <w:t xml:space="preserve">Hospital map</w:t>
             </w:r>
           </w:p>
         </w:tc>
@@ -1251,7 +1251,7 @@
                 <w:sz w:val="19"/>
                 <w:szCs w:val="19"/>
               </w:rPr>
-              <w:t xml:space="preserve">Keyword matching + precautions list</w:t>
+              <w:t xml:space="preserve">Leaflet + OpenStreetMap (Overpass)</w:t>
             </w:r>
           </w:p>
         </w:tc>
@@ -1282,7 +1282,7 @@
                 <w:sz w:val="19"/>
                 <w:szCs w:val="19"/>
               </w:rPr>
-              <w:t xml:space="preserve">Deployment</w:t>
+              <w:t xml:space="preserve">Recommendation assistant</w:t>
             </w:r>
           </w:p>
         </w:tc>
@@ -1341,7 +1341,7 @@
                 <w:sz w:val="19"/>
                 <w:szCs w:val="19"/>
               </w:rPr>
-              <w:t xml:space="preserve">Vercel (frontend), Render or Railway (backend)</w:t>
+              <w:t xml:space="preserve">Keyword matching + precautions list</w:t>
             </w:r>
           </w:p>
         </w:tc>
@@ -1372,7 +1372,7 @@
                 <w:sz w:val="19"/>
                 <w:szCs w:val="19"/>
               </w:rPr>
-              <w:t xml:space="preserve">Course mid-sem submission (19-30 Oct)</w:t>
+              <w:t xml:space="preserve">Deployment</w:t>
             </w:r>
           </w:p>
         </w:tc>
@@ -1385,24 +1385,24 @@
               <w:bottom w:val="single" w:color="BFBFBF" w:sz="4"/>
               <w:right w:val="single" w:color="BFBFBF" w:sz="4"/>
             </w:tcBorders>
-            <w:shd w:fill="E2EFDA" w:color="auto" w:val="clear"/>
-            <w:tcMar>
-              <w:top w:type="dxa" w:w="60"/>
-              <w:left w:type="dxa" w:w="100"/>
-              <w:bottom w:type="dxa" w:w="60"/>
-              <w:right w:type="dxa" w:w="100"/>
-            </w:tcMar>
-          </w:tcPr>
-          <w:p>
-            <w:r>
-              <w:rPr>
-                <w:rFonts w:ascii="Calibri" w:cs="Calibri" w:eastAsia="Calibri" w:hAnsi="Calibri"/>
-                <w:b w:val="false"/>
-                <w:bCs w:val="false"/>
-                <w:sz w:val="19"/>
-                <w:szCs w:val="19"/>
-              </w:rPr>
-              <w:t xml:space="preserve">Results ready</w:t>
+            <w:shd w:fill="F2F2F2" w:color="auto" w:val="clear"/>
+            <w:tcMar>
+              <w:top w:type="dxa" w:w="60"/>
+              <w:left w:type="dxa" w:w="100"/>
+              <w:bottom w:type="dxa" w:w="60"/>
+              <w:right w:type="dxa" w:w="100"/>
+            </w:tcMar>
+          </w:tcPr>
+          <w:p>
+            <w:r>
+              <w:rPr>
+                <w:rFonts w:ascii="Calibri" w:cs="Calibri" w:eastAsia="Calibri" w:hAnsi="Calibri"/>
+                <w:b w:val="false"/>
+                <w:bCs w:val="false"/>
+                <w:sz w:val="19"/>
+                <w:szCs w:val="19"/>
+              </w:rPr>
+              <w:t xml:space="preserve">Not started</w:t>
             </w:r>
           </w:p>
         </w:tc>
@@ -1431,7 +1431,7 @@
                 <w:sz w:val="19"/>
                 <w:szCs w:val="19"/>
               </w:rPr>
-              <w:t xml:space="preserve">Report/presentation still to prepare</w:t>
+              <w:t xml:space="preserve">Vercel (frontend), Render or Railway (backend)</w:t>
             </w:r>
           </w:p>
         </w:tc>
@@ -1462,6 +1462,186 @@
                 <w:sz w:val="19"/>
                 <w:szCs w:val="19"/>
               </w:rPr>
+              <w:t xml:space="preserve">Project report (4 evaluation criteria)</w:t>
+            </w:r>
+          </w:p>
+        </w:tc>
+        <w:tc>
+          <w:tcPr>
+            <w:tcW w:type="dxa" w:w="1600"/>
+            <w:tcBorders>
+              <w:top w:val="single" w:color="BFBFBF" w:sz="4"/>
+              <w:left w:val="single" w:color="BFBFBF" w:sz="4"/>
+              <w:bottom w:val="single" w:color="BFBFBF" w:sz="4"/>
+              <w:right w:val="single" w:color="BFBFBF" w:sz="4"/>
+            </w:tcBorders>
+            <w:shd w:fill="E2EFDA" w:color="auto" w:val="clear"/>
+            <w:tcMar>
+              <w:top w:type="dxa" w:w="60"/>
+              <w:left w:type="dxa" w:w="100"/>
+              <w:bottom w:type="dxa" w:w="60"/>
+              <w:right w:type="dxa" w:w="100"/>
+            </w:tcMar>
+          </w:tcPr>
+          <w:p>
+            <w:r>
+              <w:rPr>
+                <w:rFonts w:ascii="Calibri" w:cs="Calibri" w:eastAsia="Calibri" w:hAnsi="Calibri"/>
+                <w:b w:val="false"/>
+                <w:bCs w:val="false"/>
+                <w:sz w:val="19"/>
+                <w:szCs w:val="19"/>
+              </w:rPr>
+              <w:t xml:space="preserve">Done</w:t>
+            </w:r>
+          </w:p>
+        </w:tc>
+        <w:tc>
+          <w:tcPr>
+            <w:tcW w:type="dxa" w:w="4638"/>
+            <w:tcBorders>
+              <w:top w:val="single" w:color="BFBFBF" w:sz="4"/>
+              <w:left w:val="single" w:color="BFBFBF" w:sz="4"/>
+              <w:bottom w:val="single" w:color="BFBFBF" w:sz="4"/>
+              <w:right w:val="single" w:color="BFBFBF" w:sz="4"/>
+            </w:tcBorders>
+            <w:tcMar>
+              <w:top w:type="dxa" w:w="60"/>
+              <w:left w:type="dxa" w:w="100"/>
+              <w:bottom w:type="dxa" w:w="60"/>
+              <w:right w:type="dxa" w:w="100"/>
+            </w:tcMar>
+          </w:tcPr>
+          <w:p>
+            <w:r>
+              <w:rPr>
+                <w:rFonts w:ascii="Calibri" w:cs="Calibri" w:eastAsia="Calibri" w:hAnsi="Calibri"/>
+                <w:b w:val="false"/>
+                <w:bCs w:val="false"/>
+                <w:sz w:val="19"/>
+                <w:szCs w:val="19"/>
+              </w:rPr>
+              <w:t xml:space="preserve">15-page Word report in docs/Project_Report.docx; fill in title-page details</w:t>
+            </w:r>
+          </w:p>
+        </w:tc>
+      </w:tr>
+      <w:tr>
+        <w:tc>
+          <w:tcPr>
+            <w:tcW w:type="dxa" w:w="3400"/>
+            <w:tcBorders>
+              <w:top w:val="single" w:color="BFBFBF" w:sz="4"/>
+              <w:left w:val="single" w:color="BFBFBF" w:sz="4"/>
+              <w:bottom w:val="single" w:color="BFBFBF" w:sz="4"/>
+              <w:right w:val="single" w:color="BFBFBF" w:sz="4"/>
+            </w:tcBorders>
+            <w:tcMar>
+              <w:top w:type="dxa" w:w="60"/>
+              <w:left w:type="dxa" w:w="100"/>
+              <w:bottom w:type="dxa" w:w="60"/>
+              <w:right w:type="dxa" w:w="100"/>
+            </w:tcMar>
+          </w:tcPr>
+          <w:p>
+            <w:r>
+              <w:rPr>
+                <w:rFonts w:ascii="Calibri" w:cs="Calibri" w:eastAsia="Calibri" w:hAnsi="Calibri"/>
+                <w:b w:val="false"/>
+                <w:bCs w:val="false"/>
+                <w:sz w:val="19"/>
+                <w:szCs w:val="19"/>
+              </w:rPr>
+              <w:t xml:space="preserve">Course mid-sem submission (19-30 Oct)</w:t>
+            </w:r>
+          </w:p>
+        </w:tc>
+        <w:tc>
+          <w:tcPr>
+            <w:tcW w:type="dxa" w:w="1600"/>
+            <w:tcBorders>
+              <w:top w:val="single" w:color="BFBFBF" w:sz="4"/>
+              <w:left w:val="single" w:color="BFBFBF" w:sz="4"/>
+              <w:bottom w:val="single" w:color="BFBFBF" w:sz="4"/>
+              <w:right w:val="single" w:color="BFBFBF" w:sz="4"/>
+            </w:tcBorders>
+            <w:shd w:fill="E2EFDA" w:color="auto" w:val="clear"/>
+            <w:tcMar>
+              <w:top w:type="dxa" w:w="60"/>
+              <w:left w:type="dxa" w:w="100"/>
+              <w:bottom w:type="dxa" w:w="60"/>
+              <w:right w:type="dxa" w:w="100"/>
+            </w:tcMar>
+          </w:tcPr>
+          <w:p>
+            <w:r>
+              <w:rPr>
+                <w:rFonts w:ascii="Calibri" w:cs="Calibri" w:eastAsia="Calibri" w:hAnsi="Calibri"/>
+                <w:b w:val="false"/>
+                <w:bCs w:val="false"/>
+                <w:sz w:val="19"/>
+                <w:szCs w:val="19"/>
+              </w:rPr>
+              <w:t xml:space="preserve">Results ready</w:t>
+            </w:r>
+          </w:p>
+        </w:tc>
+        <w:tc>
+          <w:tcPr>
+            <w:tcW w:type="dxa" w:w="4638"/>
+            <w:tcBorders>
+              <w:top w:val="single" w:color="BFBFBF" w:sz="4"/>
+              <w:left w:val="single" w:color="BFBFBF" w:sz="4"/>
+              <w:bottom w:val="single" w:color="BFBFBF" w:sz="4"/>
+              <w:right w:val="single" w:color="BFBFBF" w:sz="4"/>
+            </w:tcBorders>
+            <w:tcMar>
+              <w:top w:type="dxa" w:w="60"/>
+              <w:left w:type="dxa" w:w="100"/>
+              <w:bottom w:type="dxa" w:w="60"/>
+              <w:right w:type="dxa" w:w="100"/>
+            </w:tcMar>
+          </w:tcPr>
+          <w:p>
+            <w:r>
+              <w:rPr>
+                <w:rFonts w:ascii="Calibri" w:cs="Calibri" w:eastAsia="Calibri" w:hAnsi="Calibri"/>
+                <w:b w:val="false"/>
+                <w:bCs w:val="false"/>
+                <w:sz w:val="19"/>
+                <w:szCs w:val="19"/>
+              </w:rPr>
+              <w:t xml:space="preserve">Presentation still to prepare (report content can be reused)</w:t>
+            </w:r>
+          </w:p>
+        </w:tc>
+      </w:tr>
+      <w:tr>
+        <w:tc>
+          <w:tcPr>
+            <w:tcW w:type="dxa" w:w="3400"/>
+            <w:tcBorders>
+              <w:top w:val="single" w:color="BFBFBF" w:sz="4"/>
+              <w:left w:val="single" w:color="BFBFBF" w:sz="4"/>
+              <w:bottom w:val="single" w:color="BFBFBF" w:sz="4"/>
+              <w:right w:val="single" w:color="BFBFBF" w:sz="4"/>
+            </w:tcBorders>
+            <w:tcMar>
+              <w:top w:type="dxa" w:w="60"/>
+              <w:left w:type="dxa" w:w="100"/>
+              <w:bottom w:type="dxa" w:w="60"/>
+              <w:right w:type="dxa" w:w="100"/>
+            </w:tcMar>
+          </w:tcPr>
+          <w:p>
+            <w:r>
+              <w:rPr>
+                <w:rFonts w:ascii="Calibri" w:cs="Calibri" w:eastAsia="Calibri" w:hAnsi="Calibri"/>
+                <w:b w:val="false"/>
+                <w:bCs w:val="false"/>
+                <w:sz w:val="19"/>
+                <w:szCs w:val="19"/>
+              </w:rPr>
               <w:t xml:space="preserve">Course final submission (16-27 Nov)</w:t>
             </w:r>
           </w:p>
@@ -1521,7 +1701,7 @@
                 <w:sz w:val="19"/>
                 <w:szCs w:val="19"/>
               </w:rPr>
-              <w:t xml:space="preserve">Report/presentation still to prepare</w:t>
+              <w:t xml:space="preserve">Presentation still to prepare (report content can be reused)</w:t>
             </w:r>
           </w:p>
         </w:tc>
@@ -1551,7 +1731,7 @@
         <w:rPr>
           <w:rFonts w:ascii="Calibri" w:cs="Calibri" w:eastAsia="Calibri" w:hAnsi="Calibri"/>
         </w:rPr>
-        <w:t xml:space="preserve">Tell me when to start coding the frontend (design is approved).</w:t>
+        <w:t xml:space="preserve">Try the site locally: start the API, then run npm run dev in frontend/ and open http://localhost:3000.</w:t>
       </w:r>
     </w:p>
     <w:p>
@@ -1567,7 +1747,7 @@
         <w:rPr>
           <w:rFonts w:ascii="Calibri" w:cs="Calibri" w:eastAsia="Calibri" w:hAnsi="Calibri"/>
         </w:rPr>
-        <w:t xml:space="preserve">Optional: confirm the small frontend choices (frontend/ folder in this repo, npm, react-leaflet for the map).</w:t>
+        <w:t xml:space="preserve">Fill in the title-page details in docs/Project_Report.docx before submitting it.</w:t>
       </w:r>
     </w:p>
     <w:p>
@@ -2184,6 +2364,140 @@
           <w:rFonts w:ascii="Calibri" w:cs="Calibri" w:eastAsia="Calibri" w:hAnsi="Calibri"/>
         </w:rPr>
         <w:t xml:space="preserve">Spec saved in docs/frontend_design.md with the approved preview in docs/design/.</w:t>
+      </w:r>
+    </w:p>
+    <w:p>
+      <w:pPr>
+        <w:pStyle w:val="Heading2"/>
+      </w:pPr>
+      <w:r>
+        <w:rPr>
+          <w:rFonts w:ascii="Calibri" w:cs="Calibri" w:eastAsia="Calibri" w:hAnsi="Calibri"/>
+        </w:rPr>
+        <w:t xml:space="preserve">Project report</w:t>
+      </w:r>
+    </w:p>
+    <w:p>
+      <w:pPr>
+        <w:pStyle w:val="ListParagraph"/>
+        <w:numPr>
+          <w:ilvl w:val="0"/>
+          <w:numId w:val="2"/>
+        </w:numPr>
+        <w:spacing w:after="60"/>
+      </w:pPr>
+      <w:r>
+        <w:rPr>
+          <w:rFonts w:ascii="Calibri" w:cs="Calibri" w:eastAsia="Calibri" w:hAnsi="Calibri"/>
+        </w:rPr>
+        <w:t xml:space="preserve">15-page Word report (docs/Project_Report.docx) structured around the four evaluation criteria: review of existing systems and feasibility, objectives and methodology, relevance of algorithms, and synchronisation of design and implementation.</w:t>
+      </w:r>
+    </w:p>
+    <w:p>
+      <w:pPr>
+        <w:pStyle w:val="ListParagraph"/>
+        <w:numPr>
+          <w:ilvl w:val="0"/>
+          <w:numId w:val="2"/>
+        </w:numPr>
+        <w:spacing w:after="60"/>
+      </w:pPr>
+      <w:r>
+        <w:rPr>
+          <w:rFonts w:ascii="Calibri" w:cs="Calibri" w:eastAsia="Calibri" w:hAnsi="Calibri"/>
+        </w:rPr>
+        <w:t xml:space="preserve">Includes 11 figures (architecture, methodology, data overview, Ahmedabad sensor fix, STL decomposition, evaluation windows, model comparison, forecasts, health results, dashboard design) and 9 tables, all from the project's actual results, plus 15 references.</w:t>
+      </w:r>
+    </w:p>
+    <w:p>
+      <w:pPr>
+        <w:pStyle w:val="ListParagraph"/>
+        <w:numPr>
+          <w:ilvl w:val="0"/>
+          <w:numId w:val="2"/>
+        </w:numPr>
+        <w:spacing w:after="60"/>
+      </w:pPr>
+      <w:r>
+        <w:rPr>
+          <w:rFonts w:ascii="Calibri" w:cs="Calibri" w:eastAsia="Calibri" w:hAnsi="Calibri"/>
+        </w:rPr>
+        <w:t xml:space="preserve">A cleaned dataset export (data/processed/city_day_clean.csv) was also produced on request.</w:t>
+      </w:r>
+    </w:p>
+    <w:p>
+      <w:pPr>
+        <w:pStyle w:val="Heading2"/>
+      </w:pPr>
+      <w:r>
+        <w:rPr>
+          <w:rFonts w:ascii="Calibri" w:cs="Calibri" w:eastAsia="Calibri" w:hAnsi="Calibri"/>
+        </w:rPr>
+        <w:t xml:space="preserve">Frontend: landing page and dashboard</w:t>
+      </w:r>
+    </w:p>
+    <w:p>
+      <w:pPr>
+        <w:pStyle w:val="ListParagraph"/>
+        <w:numPr>
+          <w:ilvl w:val="0"/>
+          <w:numId w:val="2"/>
+        </w:numPr>
+        <w:spacing w:after="60"/>
+      </w:pPr>
+      <w:r>
+        <w:rPr>
+          <w:rFonts w:ascii="Calibri" w:cs="Calibri" w:eastAsia="Calibri" w:hAnsi="Calibri"/>
+        </w:rPr>
+        <w:t xml:space="preserve">Next.js app in frontend/ with React + TypeScript, Tailwind CSS, shadcn/ui, Motion, ECharts and Lucide icons, following the approved Airware design.</w:t>
+      </w:r>
+    </w:p>
+    <w:p>
+      <w:pPr>
+        <w:pStyle w:val="ListParagraph"/>
+        <w:numPr>
+          <w:ilvl w:val="0"/>
+          <w:numId w:val="2"/>
+        </w:numPr>
+        <w:spacing w:after="60"/>
+      </w:pPr>
+      <w:r>
+        <w:rPr>
+          <w:rFonts w:ascii="Calibri" w:cs="Calibri" w:eastAsia="Calibri" w:hAnsi="Calibri"/>
+        </w:rPr>
+        <w:t xml:space="preserve">Landing page: hero with a live dashboard preview, city AQI strip, two-person risk comparison computed live by the models, how it works, features, model results from the leaderboard, AQI scale, privacy and FAQ.</w:t>
+      </w:r>
+    </w:p>
+    <w:p>
+      <w:pPr>
+        <w:pStyle w:val="ListParagraph"/>
+        <w:numPr>
+          <w:ilvl w:val="0"/>
+          <w:numId w:val="2"/>
+        </w:numPr>
+        <w:spacing w:after="60"/>
+      </w:pPr>
+      <w:r>
+        <w:rPr>
+          <w:rFonts w:ascii="Calibri" w:cs="Calibri" w:eastAsia="Calibri" w:hAnsi="Calibri"/>
+        </w:rPr>
+        <w:t xml:space="preserve">Dashboard: city tabs, tomorrow's AQI on the CPCB scale with health advice, 7/30-day forecast chart, pollutant trends, 7-day risk for an example profile, precautions and an all-cities table; city and horizon are kept in the page address.</w:t>
+      </w:r>
+    </w:p>
+    <w:p>
+      <w:pPr>
+        <w:pStyle w:val="ListParagraph"/>
+        <w:numPr>
+          <w:ilvl w:val="0"/>
+          <w:numId w:val="2"/>
+        </w:numPr>
+        <w:spacing w:after="60"/>
+      </w:pPr>
+      <w:r>
+        <w:rPr>
+          <w:rFonts w:ascii="Calibri" w:cs="Calibri" w:eastAsia="Calibri" w:hAnsi="Calibri"/>
+        </w:rPr>
+        <w:t xml:space="preserve">Light and dark themes with a toggle; layouts checked at 1280, 1536 and 1920 px; type check, lint and production build all pass.</w:t>
       </w:r>
     </w:p>
     <w:p>
@@ -4683,7 +4997,7 @@
                 <w:sz w:val="19"/>
                 <w:szCs w:val="19"/>
               </w:rPr>
-              <w:t xml:space="preserve">Next.js frontend</w:t>
+              <w:t xml:space="preserve">Frontend: remaining pages</w:t>
             </w:r>
           </w:p>
         </w:tc>
@@ -4741,7 +5055,7 @@
                 <w:sz w:val="19"/>
                 <w:szCs w:val="19"/>
               </w:rPr>
-              <w:t xml:space="preserve">City forecast charts, one-time profile form, day-by-day risk view, history, leaderboard, disclaimer</w:t>
+              <w:t xml:space="preserve">Sign-in, one-time profile wizard, my risk (day by day), history, models leaderboard, forecast detail</w:t>
             </w:r>
           </w:p>
         </w:tc>
@@ -5430,6 +5744,126 @@
                 <w:szCs w:val="19"/>
               </w:rPr>
               <w:t xml:space="preserve">What changed</w:t>
+            </w:r>
+          </w:p>
+        </w:tc>
+      </w:tr>
+      <w:tr>
+        <w:tc>
+          <w:tcPr>
+            <w:tcW w:type="dxa" w:w="1900"/>
+            <w:tcBorders>
+              <w:top w:val="single" w:color="BFBFBF" w:sz="4"/>
+              <w:left w:val="single" w:color="BFBFBF" w:sz="4"/>
+              <w:bottom w:val="single" w:color="BFBFBF" w:sz="4"/>
+              <w:right w:val="single" w:color="BFBFBF" w:sz="4"/>
+            </w:tcBorders>
+            <w:tcMar>
+              <w:top w:type="dxa" w:w="60"/>
+              <w:left w:type="dxa" w:w="100"/>
+              <w:bottom w:type="dxa" w:w="60"/>
+              <w:right w:type="dxa" w:w="100"/>
+            </w:tcMar>
+          </w:tcPr>
+          <w:p>
+            <w:r>
+              <w:rPr>
+                <w:rFonts w:ascii="Calibri" w:cs="Calibri" w:eastAsia="Calibri" w:hAnsi="Calibri"/>
+                <w:b w:val="false"/>
+                <w:bCs w:val="false"/>
+                <w:sz w:val="19"/>
+                <w:szCs w:val="19"/>
+              </w:rPr>
+              <w:t xml:space="preserve">5 Oct 2026</w:t>
+            </w:r>
+          </w:p>
+        </w:tc>
+        <w:tc>
+          <w:tcPr>
+            <w:tcW w:type="dxa" w:w="7738"/>
+            <w:tcBorders>
+              <w:top w:val="single" w:color="BFBFBF" w:sz="4"/>
+              <w:left w:val="single" w:color="BFBFBF" w:sz="4"/>
+              <w:bottom w:val="single" w:color="BFBFBF" w:sz="4"/>
+              <w:right w:val="single" w:color="BFBFBF" w:sz="4"/>
+            </w:tcBorders>
+            <w:tcMar>
+              <w:top w:type="dxa" w:w="60"/>
+              <w:left w:type="dxa" w:w="100"/>
+              <w:bottom w:type="dxa" w:w="60"/>
+              <w:right w:type="dxa" w:w="100"/>
+            </w:tcMar>
+          </w:tcPr>
+          <w:p>
+            <w:r>
+              <w:rPr>
+                <w:rFonts w:ascii="Calibri" w:cs="Calibri" w:eastAsia="Calibri" w:hAnsi="Calibri"/>
+                <w:b w:val="false"/>
+                <w:bCs w:val="false"/>
+                <w:sz w:val="19"/>
+                <w:szCs w:val="19"/>
+              </w:rPr>
+              <w:t xml:space="preserve">Frontend started: landing page and dashboard built on the live API, light and dark themes.</w:t>
+            </w:r>
+          </w:p>
+        </w:tc>
+      </w:tr>
+      <w:tr>
+        <w:tc>
+          <w:tcPr>
+            <w:tcW w:type="dxa" w:w="1900"/>
+            <w:tcBorders>
+              <w:top w:val="single" w:color="BFBFBF" w:sz="4"/>
+              <w:left w:val="single" w:color="BFBFBF" w:sz="4"/>
+              <w:bottom w:val="single" w:color="BFBFBF" w:sz="4"/>
+              <w:right w:val="single" w:color="BFBFBF" w:sz="4"/>
+            </w:tcBorders>
+            <w:tcMar>
+              <w:top w:type="dxa" w:w="60"/>
+              <w:left w:type="dxa" w:w="100"/>
+              <w:bottom w:type="dxa" w:w="60"/>
+              <w:right w:type="dxa" w:w="100"/>
+            </w:tcMar>
+          </w:tcPr>
+          <w:p>
+            <w:r>
+              <w:rPr>
+                <w:rFonts w:ascii="Calibri" w:cs="Calibri" w:eastAsia="Calibri" w:hAnsi="Calibri"/>
+                <w:b w:val="false"/>
+                <w:bCs w:val="false"/>
+                <w:sz w:val="19"/>
+                <w:szCs w:val="19"/>
+              </w:rPr>
+              <w:t xml:space="preserve">5 Oct 2026</w:t>
+            </w:r>
+          </w:p>
+        </w:tc>
+        <w:tc>
+          <w:tcPr>
+            <w:tcW w:type="dxa" w:w="7738"/>
+            <w:tcBorders>
+              <w:top w:val="single" w:color="BFBFBF" w:sz="4"/>
+              <w:left w:val="single" w:color="BFBFBF" w:sz="4"/>
+              <w:bottom w:val="single" w:color="BFBFBF" w:sz="4"/>
+              <w:right w:val="single" w:color="BFBFBF" w:sz="4"/>
+            </w:tcBorders>
+            <w:tcMar>
+              <w:top w:type="dxa" w:w="60"/>
+              <w:left w:type="dxa" w:w="100"/>
+              <w:bottom w:type="dxa" w:w="60"/>
+              <w:right w:type="dxa" w:w="100"/>
+            </w:tcMar>
+          </w:tcPr>
+          <w:p>
+            <w:r>
+              <w:rPr>
+                <w:rFonts w:ascii="Calibri" w:cs="Calibri" w:eastAsia="Calibri" w:hAnsi="Calibri"/>
+                <w:b w:val="false"/>
+                <w:bCs w:val="false"/>
+                <w:sz w:val="19"/>
+                <w:szCs w:val="19"/>
+              </w:rPr>
+              <w:t xml:space="preserve">Project report written (15 pages, 11 figures, 9 tables); cleaned dataset exported to CSV.</w:t>
             </w:r>
           </w:p>
         </w:tc>

</xml_diff>

<commit_message>
Frontend: sign-in, profile wizard, My risk, History and Models pages
- Supabase email sign-in/sign-up with session provider, RequireAuth and user menu
- 3-step health-profile wizard (required exposure fields + optional details)
- My risk: day-by-day risk with ranges, score and AQI charts, precautions,
  High/Severe callout; reuses the latest saved run unless the profile changed
- History list, run detail and delete
- Models leaderboard: AQI/PM2.5/NO2 per city and health models
- Docs and progress report updated

Co-Authored-By: Claude Sonnet 5.5 <noreply@anthropic.com>
</commit_message>
<xml_diff>
--- a/docs/Project_Progress.docx
+++ b/docs/Project_Progress.docx
@@ -47,7 +47,7 @@
           <w:sz w:val="18"/>
           <w:szCs w:val="18"/>
         </w:rPr>
-        <w:t xml:space="preserve">Last updated: 5 October 2026    |    Latest commit: 836d8f7 Supabase accounts; design docs pending commit</w:t>
+        <w:t xml:space="preserve">Last updated: 6 October 2026    |    Latest commit: 75af4ea Landing page and dashboard; signed-in pages pending commit</w:t>
       </w:r>
     </w:p>
     <w:p>
@@ -1115,24 +1115,24 @@
               <w:bottom w:val="single" w:color="BFBFBF" w:sz="4"/>
               <w:right w:val="single" w:color="BFBFBF" w:sz="4"/>
             </w:tcBorders>
-            <w:shd w:fill="F2F2F2" w:color="auto" w:val="clear"/>
-            <w:tcMar>
-              <w:top w:type="dxa" w:w="60"/>
-              <w:left w:type="dxa" w:w="100"/>
-              <w:bottom w:type="dxa" w:w="60"/>
-              <w:right w:type="dxa" w:w="100"/>
-            </w:tcMar>
-          </w:tcPr>
-          <w:p>
-            <w:r>
-              <w:rPr>
-                <w:rFonts w:ascii="Calibri" w:cs="Calibri" w:eastAsia="Calibri" w:hAnsi="Calibri"/>
-                <w:b w:val="false"/>
-                <w:bCs w:val="false"/>
-                <w:sz w:val="19"/>
-                <w:szCs w:val="19"/>
-              </w:rPr>
-              <w:t xml:space="preserve">Not started</w:t>
+            <w:shd w:fill="E2EFDA" w:color="auto" w:val="clear"/>
+            <w:tcMar>
+              <w:top w:type="dxa" w:w="60"/>
+              <w:left w:type="dxa" w:w="100"/>
+              <w:bottom w:type="dxa" w:w="60"/>
+              <w:right w:type="dxa" w:w="100"/>
+            </w:tcMar>
+          </w:tcPr>
+          <w:p>
+            <w:r>
+              <w:rPr>
+                <w:rFonts w:ascii="Calibri" w:cs="Calibri" w:eastAsia="Calibri" w:hAnsi="Calibri"/>
+                <w:b w:val="false"/>
+                <w:bCs w:val="false"/>
+                <w:sz w:val="19"/>
+                <w:szCs w:val="19"/>
+              </w:rPr>
+              <w:t xml:space="preserve">Done</w:t>
             </w:r>
           </w:p>
         </w:tc>
@@ -1161,7 +1161,7 @@
                 <w:sz w:val="19"/>
                 <w:szCs w:val="19"/>
               </w:rPr>
-              <w:t xml:space="preserve">Placeholder pages in place; next build step</w:t>
+              <w:t xml:space="preserve">Built on the live API; sign-in flow to be tested by you with a real account</w:t>
             </w:r>
           </w:p>
         </w:tc>
@@ -1731,7 +1731,7 @@
         <w:rPr>
           <w:rFonts w:ascii="Calibri" w:cs="Calibri" w:eastAsia="Calibri" w:hAnsi="Calibri"/>
         </w:rPr>
-        <w:t xml:space="preserve">Try the site locally: start the API, then run npm run dev in frontend/ and open http://localhost:3000.</w:t>
+        <w:t xml:space="preserve">Test the signed-in pages with a real account: create an account, confirm the email, fill in the profile, check My risk, then History (open and delete a run).</w:t>
       </w:r>
     </w:p>
     <w:p>
@@ -1747,29 +1747,7 @@
         <w:rPr>
           <w:rFonts w:ascii="Calibri" w:cs="Calibri" w:eastAsia="Calibri" w:hAnsi="Calibri"/>
         </w:rPr>
-        <w:t xml:space="preserve">Fill in the title-page details in docs/Project_Report.docx before submitting it.</w:t>
-      </w:r>
-    </w:p>
-    <w:p>
-      <w:pPr>
-        <w:pStyle w:val="Heading1"/>
-      </w:pPr>
-      <w:r>
-        <w:rPr>
-          <w:rFonts w:ascii="Calibri" w:cs="Calibri" w:eastAsia="Calibri" w:hAnsi="Calibri"/>
-        </w:rPr>
-        <w:t xml:space="preserve">3. Work completed</w:t>
-      </w:r>
-    </w:p>
-    <w:p>
-      <w:pPr>
-        <w:pStyle w:val="Heading2"/>
-      </w:pPr>
-      <w:r>
-        <w:rPr>
-          <w:rFonts w:ascii="Calibri" w:cs="Calibri" w:eastAsia="Calibri" w:hAnsi="Calibri"/>
-        </w:rPr>
-        <w:t xml:space="preserve">AQI forecasting pipeline</w:t>
+        <w:t xml:space="preserve">Try the site locally: start the API, then run npm run dev in frontend/ and open http://localhost:3000.</w:t>
       </w:r>
     </w:p>
     <w:p>
@@ -1785,7 +1763,29 @@
         <w:rPr>
           <w:rFonts w:ascii="Calibri" w:cs="Calibri" w:eastAsia="Calibri" w:hAnsi="Calibri"/>
         </w:rPr>
-        <w:t xml:space="preserve">Data loading for Delhi, Bengaluru, Chennai, Hyderabad, Lucknow and Ahmedabad (CPCB data, 2015-2020); gaps up to 21 days interpolated.</w:t>
+        <w:t xml:space="preserve">Fill in the title-page details in docs/Project_Report.docx before submitting it.</w:t>
+      </w:r>
+    </w:p>
+    <w:p>
+      <w:pPr>
+        <w:pStyle w:val="Heading1"/>
+      </w:pPr>
+      <w:r>
+        <w:rPr>
+          <w:rFonts w:ascii="Calibri" w:cs="Calibri" w:eastAsia="Calibri" w:hAnsi="Calibri"/>
+        </w:rPr>
+        <w:t xml:space="preserve">3. Work completed</w:t>
+      </w:r>
+    </w:p>
+    <w:p>
+      <w:pPr>
+        <w:pStyle w:val="Heading2"/>
+      </w:pPr>
+      <w:r>
+        <w:rPr>
+          <w:rFonts w:ascii="Calibri" w:cs="Calibri" w:eastAsia="Calibri" w:hAnsi="Calibri"/>
+        </w:rPr>
+        <w:t xml:space="preserve">AQI forecasting pipeline</w:t>
       </w:r>
     </w:p>
     <w:p>
@@ -1801,7 +1801,7 @@
         <w:rPr>
           <w:rFonts w:ascii="Calibri" w:cs="Calibri" w:eastAsia="Calibri" w:hAnsi="Calibri"/>
         </w:rPr>
-        <w:t xml:space="preserve">Diagnostics: ADF and KPSS stationarity tests (no differencing needed), seasonal period confirmed at ~365 days (ACF peaks at lags 363-370, STL seasonal strength).</w:t>
+        <w:t xml:space="preserve">Data loading for Delhi, Bengaluru, Chennai, Hyderabad, Lucknow and Ahmedabad (CPCB data, 2015-2020); gaps up to 21 days interpolated.</w:t>
       </w:r>
     </w:p>
     <w:p>
@@ -1817,7 +1817,7 @@
         <w:rPr>
           <w:rFonts w:ascii="Calibri" w:cs="Calibri" w:eastAsia="Calibri" w:hAnsi="Calibri"/>
         </w:rPr>
-        <w:t xml:space="preserve">Models: ARIMA, SARIMA (weekly + annual Fourier terms), Holt-Winters, LSTM, XGBoost on lag features, Prophet; compared with three naive baselines.</w:t>
+        <w:t xml:space="preserve">Diagnostics: ADF and KPSS stationarity tests (no differencing needed), seasonal period confirmed at ~365 days (ACF peaks at lags 363-370, STL seasonal strength).</w:t>
       </w:r>
     </w:p>
     <w:p>
@@ -1833,7 +1833,7 @@
         <w:rPr>
           <w:rFonts w:ascii="Calibri" w:cs="Calibri" w:eastAsia="Calibri" w:hAnsi="Calibri"/>
         </w:rPr>
-        <w:t xml:space="preserve">Evaluation on 6 non-overlapping 30-day test windows per city (RMSE, MSE, MAE, MAPE); winner = lowest mean RMSE.</w:t>
+        <w:t xml:space="preserve">Models: ARIMA, SARIMA (weekly + annual Fourier terms), Holt-Winters, LSTM, XGBoost on lag features, Prophet; compared with three naive baselines.</w:t>
       </w:r>
     </w:p>
     <w:p>
@@ -1849,7 +1849,7 @@
         <w:rPr>
           <w:rFonts w:ascii="Calibri" w:cs="Calibri" w:eastAsia="Calibri" w:hAnsi="Calibri"/>
         </w:rPr>
-        <w:t xml:space="preserve">Ahmedabad fix: its CO sensor readings were faulty (median 16 mg/m3 vs about 1 elsewhere, AQI up to 2,049), so its AQI is recomputed from hourly data without CO. The method reproduces the published values exactly when CO is included.</w:t>
+        <w:t xml:space="preserve">Evaluation on 6 non-overlapping 30-day test windows per city (RMSE, MSE, MAE, MAPE); winner = lowest mean RMSE.</w:t>
       </w:r>
     </w:p>
     <w:p>
@@ -1865,18 +1865,7 @@
         <w:rPr>
           <w:rFonts w:ascii="Calibri" w:cs="Calibri" w:eastAsia="Calibri" w:hAnsi="Calibri"/>
         </w:rPr>
-        <w:t xml:space="preserve">LSTM results averaged over seeds 42, 43 and 44 (a single seed gave a misleadingly good Delhi result).</w:t>
-      </w:r>
-    </w:p>
-    <w:p>
-      <w:pPr>
-        <w:pStyle w:val="Heading2"/>
-      </w:pPr>
-      <w:r>
-        <w:rPr>
-          <w:rFonts w:ascii="Calibri" w:cs="Calibri" w:eastAsia="Calibri" w:hAnsi="Calibri"/>
-        </w:rPr>
-        <w:t xml:space="preserve">Pollutant forecasting (PM2.5, NO2)</w:t>
+        <w:t xml:space="preserve">Ahmedabad fix: its CO sensor readings were faulty (median 16 mg/m3 vs about 1 elsewhere, AQI up to 2,049), so its AQI is recomputed from hourly data without CO. The method reproduces the published values exactly when CO is included.</w:t>
       </w:r>
     </w:p>
     <w:p>
@@ -1892,7 +1881,18 @@
         <w:rPr>
           <w:rFonts w:ascii="Calibri" w:cs="Calibri" w:eastAsia="Calibri" w:hAnsi="Calibri"/>
         </w:rPr>
-        <w:t xml:space="preserve">Same evaluation for PM2.5 and NO2, the only pollutants with usable history in all six cities.</w:t>
+        <w:t xml:space="preserve">LSTM results averaged over seeds 42, 43 and 44 (a single seed gave a misleadingly good Delhi result).</w:t>
+      </w:r>
+    </w:p>
+    <w:p>
+      <w:pPr>
+        <w:pStyle w:val="Heading2"/>
+      </w:pPr>
+      <w:r>
+        <w:rPr>
+          <w:rFonts w:ascii="Calibri" w:cs="Calibri" w:eastAsia="Calibri" w:hAnsi="Calibri"/>
+        </w:rPr>
+        <w:t xml:space="preserve">Pollutant forecasting (PM2.5, NO2)</w:t>
       </w:r>
     </w:p>
     <w:p>
@@ -1908,18 +1908,7 @@
         <w:rPr>
           <w:rFonts w:ascii="Calibri" w:cs="Calibri" w:eastAsia="Calibri" w:hAnsi="Calibri"/>
         </w:rPr>
-        <w:t xml:space="preserve">Where no model beats the naive forecast on mean RMSE, the naive forecast itself is deployed (Hyderabad PM2.5, Ahmedabad NO2).</w:t>
-      </w:r>
-    </w:p>
-    <w:p>
-      <w:pPr>
-        <w:pStyle w:val="Heading2"/>
-      </w:pPr>
-      <w:r>
-        <w:rPr>
-          <w:rFonts w:ascii="Calibri" w:cs="Calibri" w:eastAsia="Calibri" w:hAnsi="Calibri"/>
-        </w:rPr>
-        <w:t xml:space="preserve">Saved forecasting models</w:t>
+        <w:t xml:space="preserve">Same evaluation for PM2.5 and NO2, the only pollutants with usable history in all six cities.</w:t>
       </w:r>
     </w:p>
     <w:p>
@@ -1935,7 +1924,18 @@
         <w:rPr>
           <w:rFonts w:ascii="Calibri" w:cs="Calibri" w:eastAsia="Calibri" w:hAnsi="Calibri"/>
         </w:rPr>
-        <w:t xml:space="preserve">Each city's winner retrained on its full history and saved in its native format (joblib, XGBoost .ubj, PyTorch state_dict, Prophet JSON), with metadata and a registry.</w:t>
+        <w:t xml:space="preserve">Where no model beats the naive forecast on mean RMSE, the naive forecast itself is deployed (Hyderabad PM2.5, Ahmedabad NO2).</w:t>
+      </w:r>
+    </w:p>
+    <w:p>
+      <w:pPr>
+        <w:pStyle w:val="Heading2"/>
+      </w:pPr>
+      <w:r>
+        <w:rPr>
+          <w:rFonts w:ascii="Calibri" w:cs="Calibri" w:eastAsia="Calibri" w:hAnsi="Calibri"/>
+        </w:rPr>
+        <w:t xml:space="preserve">Saved forecasting models</w:t>
       </w:r>
     </w:p>
     <w:p>
@@ -1951,18 +1951,7 @@
         <w:rPr>
           <w:rFonts w:ascii="Calibri" w:cs="Calibri" w:eastAsia="Calibri" w:hAnsi="Calibri"/>
         </w:rPr>
-        <w:t xml:space="preserve">Verified: reloaded models reproduce the in-memory forecasts exactly.</w:t>
-      </w:r>
-    </w:p>
-    <w:p>
-      <w:pPr>
-        <w:pStyle w:val="Heading2"/>
-      </w:pPr>
-      <w:r>
-        <w:rPr>
-          <w:rFonts w:ascii="Calibri" w:cs="Calibri" w:eastAsia="Calibri" w:hAnsi="Calibri"/>
-        </w:rPr>
-        <w:t xml:space="preserve">Health-risk models</w:t>
+        <w:t xml:space="preserve">Each city's winner retrained on its full history and saved in its native format (joblib, XGBoost .ubj, PyTorch state_dict, Prophet JSON), with metadata and a registry.</w:t>
       </w:r>
     </w:p>
     <w:p>
@@ -1978,7 +1967,18 @@
         <w:rPr>
           <w:rFonts w:ascii="Calibri" w:cs="Calibri" w:eastAsia="Calibri" w:hAnsi="Calibri"/>
         </w:rPr>
-        <w:t xml:space="preserve">Random Forest, XGBoost and MLP compared for risk level (weighted F1) and risk score (RMSE), with 5-fold cross-validation and a held-out 20% test set.</w:t>
+        <w:t xml:space="preserve">Verified: reloaded models reproduce the in-memory forecasts exactly.</w:t>
+      </w:r>
+    </w:p>
+    <w:p>
+      <w:pPr>
+        <w:pStyle w:val="Heading2"/>
+      </w:pPr>
+      <w:r>
+        <w:rPr>
+          <w:rFonts w:ascii="Calibri" w:cs="Calibri" w:eastAsia="Calibri" w:hAnsi="Calibri"/>
+        </w:rPr>
+        <w:t xml:space="preserve">Health-risk models</w:t>
       </w:r>
     </w:p>
     <w:p>
@@ -1994,7 +1994,7 @@
         <w:rPr>
           <w:rFonts w:ascii="Calibri" w:cs="Calibri" w:eastAsia="Calibri" w:hAnsi="Calibri"/>
         </w:rPr>
-        <w:t xml:space="preserve">MLP selected for both tasks. Primary model uses the profile plus AQI, PM2.5 and NO2; an AQI-only model is the automatic fallback.</w:t>
+        <w:t xml:space="preserve">Random Forest, XGBoost and MLP compared for risk level (weighted F1) and risk score (RMSE), with 5-fold cross-validation and a held-out 20% test set.</w:t>
       </w:r>
     </w:p>
     <w:p>
@@ -2010,7 +2010,7 @@
         <w:rPr>
           <w:rFonts w:ascii="Calibri" w:cs="Calibri" w:eastAsia="Calibri" w:hAnsi="Calibri"/>
         </w:rPr>
-        <w:t xml:space="preserve">Boundary rule: the classifier's level is the headline; days where the score implies a neighbouring level are flagged borderline and shown as a range; the higher level drives High/Severe alerts.</w:t>
+        <w:t xml:space="preserve">MLP selected for both tasks. Primary model uses the profile plus AQI, PM2.5 and NO2; an AQI-only model is the automatic fallback.</w:t>
       </w:r>
     </w:p>
     <w:p>
@@ -2026,18 +2026,7 @@
         <w:rPr>
           <w:rFonts w:ascii="Calibri" w:cs="Calibri" w:eastAsia="Calibri" w:hAnsi="Calibri"/>
         </w:rPr>
-        <w:t xml:space="preserve">Backtest on real historical forecasts: the pollutant model beats the AQI-only model (73.3% vs 68.5% level agreement with the reference).</w:t>
-      </w:r>
-    </w:p>
-    <w:p>
-      <w:pPr>
-        <w:pStyle w:val="Heading2"/>
-      </w:pPr>
-      <w:r>
-        <w:rPr>
-          <w:rFonts w:ascii="Calibri" w:cs="Calibri" w:eastAsia="Calibri" w:hAnsi="Calibri"/>
-        </w:rPr>
-        <w:t xml:space="preserve">FastAPI backend (public part)</w:t>
+        <w:t xml:space="preserve">Boundary rule: the classifier's level is the headline; days where the score implies a neighbouring level are flagged borderline and shown as a range; the higher level drives High/Severe alerts.</w:t>
       </w:r>
     </w:p>
     <w:p>
@@ -2053,7 +2042,18 @@
         <w:rPr>
           <w:rFonts w:ascii="Calibri" w:cs="Calibri" w:eastAsia="Calibri" w:hAnsi="Calibri"/>
         </w:rPr>
-        <w:t xml:space="preserve">Endpoints: /api/health, /api/cities, /api/forecast/{city}, /api/risk/predict, /api/profile/schema, /api/leaderboard/forecast, /api/leaderboard/health.</w:t>
+        <w:t xml:space="preserve">Backtest on real historical forecasts: the pollutant model beats the AQI-only model (73.3% vs 68.5% level agreement with the reference).</w:t>
+      </w:r>
+    </w:p>
+    <w:p>
+      <w:pPr>
+        <w:pStyle w:val="Heading2"/>
+      </w:pPr>
+      <w:r>
+        <w:rPr>
+          <w:rFonts w:ascii="Calibri" w:cs="Calibri" w:eastAsia="Calibri" w:hAnsi="Calibri"/>
+        </w:rPr>
+        <w:t xml:space="preserve">FastAPI backend (public part)</w:t>
       </w:r>
     </w:p>
     <w:p>
@@ -2069,7 +2069,7 @@
         <w:rPr>
           <w:rFonts w:ascii="Calibri" w:cs="Calibri" w:eastAsia="Calibri" w:hAnsi="Calibri"/>
         </w:rPr>
-        <w:t xml:space="preserve">All models load once at startup (~20 s); requests after that take well under a second.</w:t>
+        <w:t xml:space="preserve">Endpoints: /api/health, /api/cities, /api/forecast/{city}, /api/risk/predict, /api/profile/schema, /api/leaderboard/forecast, /api/leaderboard/health.</w:t>
       </w:r>
     </w:p>
     <w:p>
@@ -2085,7 +2085,7 @@
         <w:rPr>
           <w:rFonts w:ascii="Calibri" w:cs="Calibri" w:eastAsia="Calibri" w:hAnsi="Calibri"/>
         </w:rPr>
-        <w:t xml:space="preserve">Profile validation: occupation, area type, mask usage and outdoor hours are required (defaulting them understated risk); BMI, exercise and family history are optional.</w:t>
+        <w:t xml:space="preserve">All models load once at startup (~20 s); requests after that take well under a second.</w:t>
       </w:r>
     </w:p>
     <w:p>
@@ -2101,18 +2101,7 @@
         <w:rPr>
           <w:rFonts w:ascii="Calibri" w:cs="Calibri" w:eastAsia="Calibri" w:hAnsi="Calibri"/>
         </w:rPr>
-        <w:t xml:space="preserve">29 automated tests pass.</w:t>
-      </w:r>
-    </w:p>
-    <w:p>
-      <w:pPr>
-        <w:pStyle w:val="Heading2"/>
-      </w:pPr>
-      <w:r>
-        <w:rPr>
-          <w:rFonts w:ascii="Calibri" w:cs="Calibri" w:eastAsia="Calibri" w:hAnsi="Calibri"/>
-        </w:rPr>
-        <w:t xml:space="preserve">Supabase and user accounts</w:t>
+        <w:t xml:space="preserve">Profile validation: occupation, area type, mask usage and outdoor hours are required (defaulting them understated risk); BMI, exercise and family history are optional.</w:t>
       </w:r>
     </w:p>
     <w:p>
@@ -2128,7 +2117,18 @@
         <w:rPr>
           <w:rFonts w:ascii="Calibri" w:cs="Calibri" w:eastAsia="Calibri" w:hAnsi="Calibri"/>
         </w:rPr>
-        <w:t xml:space="preserve">Supabase project created (Mumbai region); database script run; checks confirmed public tables are readable, private tables are blocked without sign-in, and the public key can't write.</w:t>
+        <w:t xml:space="preserve">29 automated tests pass.</w:t>
+      </w:r>
+    </w:p>
+    <w:p>
+      <w:pPr>
+        <w:pStyle w:val="Heading2"/>
+      </w:pPr>
+      <w:r>
+        <w:rPr>
+          <w:rFonts w:ascii="Calibri" w:cs="Calibri" w:eastAsia="Calibri" w:hAnsi="Calibri"/>
+        </w:rPr>
+        <w:t xml:space="preserve">Supabase and user accounts</w:t>
       </w:r>
     </w:p>
     <w:p>
@@ -2144,7 +2144,7 @@
         <w:rPr>
           <w:rFonts w:ascii="Calibri" w:cs="Calibri" w:eastAsia="Calibri" w:hAnsi="Calibri"/>
         </w:rPr>
-        <w:t xml:space="preserve">Signed-in endpoints: GET/PUT /api/me/profile, POST /api/me/risk (runs a prediction with the saved profile and saves it to history), GET /api/me/history, GET/DELETE /api/me/history/{id}.</w:t>
+        <w:t xml:space="preserve">Supabase project created (Mumbai region); database script run; checks confirmed public tables are readable, private tables are blocked without sign-in, and the public key can't write.</w:t>
       </w:r>
     </w:p>
     <w:p>
@@ -2160,7 +2160,7 @@
         <w:rPr>
           <w:rFonts w:ascii="Calibri" w:cs="Calibri" w:eastAsia="Calibri" w:hAnsi="Calibri"/>
         </w:rPr>
-        <w:t xml:space="preserve">Each database call is made with the user's own sign-in token, so row-level security keeps every user's profile and history private, even inside the backend.</w:t>
+        <w:t xml:space="preserve">Signed-in endpoints: GET/PUT /api/me/profile, POST /api/me/risk (runs a prediction with the saved profile and saves it to history), GET /api/me/history, GET/DELETE /api/me/history/{id}.</w:t>
       </w:r>
     </w:p>
     <w:p>
@@ -2176,7 +2176,7 @@
         <w:rPr>
           <w:rFonts w:ascii="Calibri" w:cs="Calibri" w:eastAsia="Calibri" w:hAnsi="Calibri"/>
         </w:rPr>
-        <w:t xml:space="preserve">12 new tests using an in-memory stand-in for Supabase that enforces the same per-user rules (41 tests pass in total); the real sign-in service correctly rejects invalid tokens.</w:t>
+        <w:t xml:space="preserve">Each database call is made with the user's own sign-in token, so row-level security keeps every user's profile and history private, even inside the backend.</w:t>
       </w:r>
     </w:p>
     <w:p>
@@ -2192,7 +2192,7 @@
         <w:rPr>
           <w:rFonts w:ascii="Calibri" w:cs="Calibri" w:eastAsia="Calibri" w:hAnsi="Calibri"/>
         </w:rPr>
-        <w:t xml:space="preserve">Live end-to-end check with a real test user passed all 8 steps: save and read profile, run a prediction, list and read history, hidden without sign-in, delete, confirm deletion.</w:t>
+        <w:t xml:space="preserve">12 new tests using an in-memory stand-in for Supabase that enforces the same per-user rules (41 tests pass in total); the real sign-in service correctly rejects invalid tokens.</w:t>
       </w:r>
     </w:p>
     <w:p>
@@ -2208,7 +2208,7 @@
         <w:rPr>
           <w:rFonts w:ascii="Calibri" w:cs="Calibri" w:eastAsia="Calibri" w:hAnsi="Calibri"/>
         </w:rPr>
-        <w:t xml:space="preserve">SQL script supabase/migrations/0001_init.sql: profiles, saved_forecasts, risk_predictions, aqi_forecasts_cache, model_leaderboard.</w:t>
+        <w:t xml:space="preserve">Live end-to-end check with a real test user passed all 8 steps: save and read profile, run a prediction, list and read history, hidden without sign-in, delete, confirm deletion.</w:t>
       </w:r>
     </w:p>
     <w:p>
@@ -2224,7 +2224,7 @@
         <w:rPr>
           <w:rFonts w:ascii="Calibri" w:cs="Calibri" w:eastAsia="Calibri" w:hAnsi="Calibri"/>
         </w:rPr>
-        <w:t xml:space="preserve">Row-level security: users only see and change their own profile and history; history can't be edited; public tables are read-only except for the backend.</w:t>
+        <w:t xml:space="preserve">SQL script supabase/migrations/0001_init.sql: profiles, saved_forecasts, risk_predictions, aqi_forecasts_cache, model_leaderboard.</w:t>
       </w:r>
     </w:p>
     <w:p>
@@ -2240,18 +2240,7 @@
         <w:rPr>
           <w:rFonts w:ascii="Calibri" w:cs="Calibri" w:eastAsia="Calibri" w:hAnsi="Calibri"/>
         </w:rPr>
-        <w:t xml:space="preserve">Step-by-step setup guide (supabase/README.md) and .env.example; real keys stay in a git-ignored .env.</w:t>
-      </w:r>
-    </w:p>
-    <w:p>
-      <w:pPr>
-        <w:pStyle w:val="Heading2"/>
-      </w:pPr>
-      <w:r>
-        <w:rPr>
-          <w:rFonts w:ascii="Calibri" w:cs="Calibri" w:eastAsia="Calibri" w:hAnsi="Calibri"/>
-        </w:rPr>
-        <w:t xml:space="preserve">Frontend design (Airware)</w:t>
+        <w:t xml:space="preserve">Row-level security: users only see and change their own profile and history; history can't be edited; public tables are read-only except for the backend.</w:t>
       </w:r>
     </w:p>
     <w:p>
@@ -2267,7 +2256,18 @@
         <w:rPr>
           <w:rFonts w:ascii="Calibri" w:cs="Calibri" w:eastAsia="Calibri" w:hAnsi="Calibri"/>
         </w:rPr>
-        <w:t xml:space="preserve">Site named Airware. Stack confirmed: Next.js, React + TypeScript, Tailwind CSS, shadcn/ui, Motion, ECharts, Lucide React, Leaflet + OpenStreetMap, Overpass API.</w:t>
+        <w:t xml:space="preserve">Step-by-step setup guide (supabase/README.md) and .env.example; real keys stay in a git-ignored .env.</w:t>
+      </w:r>
+    </w:p>
+    <w:p>
+      <w:pPr>
+        <w:pStyle w:val="Heading2"/>
+      </w:pPr>
+      <w:r>
+        <w:rPr>
+          <w:rFonts w:ascii="Calibri" w:cs="Calibri" w:eastAsia="Calibri" w:hAnsi="Calibri"/>
+        </w:rPr>
+        <w:t xml:space="preserve">Frontend design (Airware)</w:t>
       </w:r>
     </w:p>
     <w:p>
@@ -2283,7 +2283,7 @@
         <w:rPr>
           <w:rFonts w:ascii="Calibri" w:cs="Calibri" w:eastAsia="Calibri" w:hAnsi="Calibri"/>
         </w:rPr>
-        <w:t xml:space="preserve">Design direction: a data-first dashboard (like IQAir or Windy) using the full screen width, with IBM Plex fonts, neutral colours, one deep-teal brand colour, and the official CPCB colours reserved for air-quality data.</w:t>
+        <w:t xml:space="preserve">Site named Airware. Stack confirmed: Next.js, React + TypeScript, Tailwind CSS, shadcn/ui, Motion, ECharts, Lucide React, Leaflet + OpenStreetMap, Overpass API.</w:t>
       </w:r>
     </w:p>
     <w:p>
@@ -2299,7 +2299,7 @@
         <w:rPr>
           <w:rFonts w:ascii="Calibri" w:cs="Calibri" w:eastAsia="Calibri" w:hAnsi="Calibri"/>
         </w:rPr>
-        <w:t xml:space="preserve">Approved overview page: city tabs, tomorrow's AQI with the CPCB scale and health advice, interactive forecast chart, pollutants, day-by-day health risk, precautions, and an all-cities comparison table.</w:t>
+        <w:t xml:space="preserve">Design direction: a data-first dashboard (like IQAir or Windy) using the full screen width, with IBM Plex fonts, neutral colours, one deep-teal brand colour, and the official CPCB colours reserved for air-quality data.</w:t>
       </w:r>
     </w:p>
     <w:p>
@@ -2315,7 +2315,7 @@
         <w:rPr>
           <w:rFonts w:ascii="Calibri" w:cs="Calibri" w:eastAsia="Calibri" w:hAnsi="Calibri"/>
         </w:rPr>
-        <w:t xml:space="preserve">Approved landing page: hero with a live dashboard preview, city AQI strip, a two-person example showing why personal risk matters, how it works, features, model results, data and AQI scale, privacy, FAQ and footer.</w:t>
+        <w:t xml:space="preserve">Approved overview page: city tabs, tomorrow's AQI with the CPCB scale and health advice, interactive forecast chart, pollutants, day-by-day health risk, precautions, and an all-cities comparison table.</w:t>
       </w:r>
     </w:p>
     <w:p>
@@ -2331,7 +2331,7 @@
         <w:rPr>
           <w:rFonts w:ascii="Calibri" w:cs="Calibri" w:eastAsia="Calibri" w:hAnsi="Calibri"/>
         </w:rPr>
-        <w:t xml:space="preserve">Site structure: landing page at /, dashboard at /dashboard, plus sign-in, profile wizard, my risk, history and models pages.</w:t>
+        <w:t xml:space="preserve">Approved landing page: hero with a live dashboard preview, city AQI strip, a two-person example showing why personal risk matters, how it works, features, model results, data and AQI scale, privacy, FAQ and footer.</w:t>
       </w:r>
     </w:p>
     <w:p>
@@ -2347,7 +2347,7 @@
         <w:rPr>
           <w:rFonts w:ascii="Calibri" w:cs="Calibri" w:eastAsia="Calibri" w:hAnsi="Calibri"/>
         </w:rPr>
-        <w:t xml:space="preserve">Light and dark themes with a toggle; layout checked at 1280, 1536 and 1920 px wide (the user's laptop at 150%, 125% and 100% scaling).</w:t>
+        <w:t xml:space="preserve">Site structure: landing page at /, dashboard at /dashboard, plus sign-in, profile wizard, my risk, history and models pages.</w:t>
       </w:r>
     </w:p>
     <w:p>
@@ -2363,18 +2363,7 @@
         <w:rPr>
           <w:rFonts w:ascii="Calibri" w:cs="Calibri" w:eastAsia="Calibri" w:hAnsi="Calibri"/>
         </w:rPr>
-        <w:t xml:space="preserve">Spec saved in docs/frontend_design.md with the approved preview in docs/design/.</w:t>
-      </w:r>
-    </w:p>
-    <w:p>
-      <w:pPr>
-        <w:pStyle w:val="Heading2"/>
-      </w:pPr>
-      <w:r>
-        <w:rPr>
-          <w:rFonts w:ascii="Calibri" w:cs="Calibri" w:eastAsia="Calibri" w:hAnsi="Calibri"/>
-        </w:rPr>
-        <w:t xml:space="preserve">Project report</w:t>
+        <w:t xml:space="preserve">Light and dark themes with a toggle; layout checked at 1280, 1536 and 1920 px wide (the user's laptop at 150%, 125% and 100% scaling).</w:t>
       </w:r>
     </w:p>
     <w:p>
@@ -2390,7 +2379,18 @@
         <w:rPr>
           <w:rFonts w:ascii="Calibri" w:cs="Calibri" w:eastAsia="Calibri" w:hAnsi="Calibri"/>
         </w:rPr>
-        <w:t xml:space="preserve">15-page Word report (docs/Project_Report.docx) structured around the four evaluation criteria: review of existing systems and feasibility, objectives and methodology, relevance of algorithms, and synchronisation of design and implementation.</w:t>
+        <w:t xml:space="preserve">Spec saved in docs/frontend_design.md with the approved preview in docs/design/.</w:t>
+      </w:r>
+    </w:p>
+    <w:p>
+      <w:pPr>
+        <w:pStyle w:val="Heading2"/>
+      </w:pPr>
+      <w:r>
+        <w:rPr>
+          <w:rFonts w:ascii="Calibri" w:cs="Calibri" w:eastAsia="Calibri" w:hAnsi="Calibri"/>
+        </w:rPr>
+        <w:t xml:space="preserve">Project report</w:t>
       </w:r>
     </w:p>
     <w:p>
@@ -2406,7 +2406,7 @@
         <w:rPr>
           <w:rFonts w:ascii="Calibri" w:cs="Calibri" w:eastAsia="Calibri" w:hAnsi="Calibri"/>
         </w:rPr>
-        <w:t xml:space="preserve">Includes 11 figures (architecture, methodology, data overview, Ahmedabad sensor fix, STL decomposition, evaluation windows, model comparison, forecasts, health results, dashboard design) and 9 tables, all from the project's actual results, plus 15 references.</w:t>
+        <w:t xml:space="preserve">15-page Word report (docs/Project_Report.docx) structured around the four evaluation criteria: review of existing systems and feasibility, objectives and methodology, relevance of algorithms, and synchronisation of design and implementation.</w:t>
       </w:r>
     </w:p>
     <w:p>
@@ -2422,7 +2422,130 @@
         <w:rPr>
           <w:rFonts w:ascii="Calibri" w:cs="Calibri" w:eastAsia="Calibri" w:hAnsi="Calibri"/>
         </w:rPr>
+        <w:t xml:space="preserve">Includes 11 figures (architecture, methodology, data overview, Ahmedabad sensor fix, STL decomposition, evaluation windows, model comparison, forecasts, health results, dashboard design) and 9 tables, all from the project's actual results, plus 15 references.</w:t>
+      </w:r>
+    </w:p>
+    <w:p>
+      <w:pPr>
+        <w:pStyle w:val="ListParagraph"/>
+        <w:numPr>
+          <w:ilvl w:val="0"/>
+          <w:numId w:val="2"/>
+        </w:numPr>
+        <w:spacing w:after="60"/>
+      </w:pPr>
+      <w:r>
+        <w:rPr>
+          <w:rFonts w:ascii="Calibri" w:cs="Calibri" w:eastAsia="Calibri" w:hAnsi="Calibri"/>
+        </w:rPr>
         <w:t xml:space="preserve">A cleaned dataset export (data/processed/city_day_clean.csv) was also produced on request.</w:t>
+      </w:r>
+    </w:p>
+    <w:p>
+      <w:pPr>
+        <w:pStyle w:val="Heading2"/>
+      </w:pPr>
+      <w:r>
+        <w:rPr>
+          <w:rFonts w:ascii="Calibri" w:cs="Calibri" w:eastAsia="Calibri" w:hAnsi="Calibri"/>
+        </w:rPr>
+        <w:t xml:space="preserve">Frontend: sign-in, profile, my risk, history and models</w:t>
+      </w:r>
+    </w:p>
+    <w:p>
+      <w:pPr>
+        <w:pStyle w:val="ListParagraph"/>
+        <w:numPr>
+          <w:ilvl w:val="0"/>
+          <w:numId w:val="2"/>
+        </w:numPr>
+        <w:spacing w:after="60"/>
+      </w:pPr>
+      <w:r>
+        <w:rPr>
+          <w:rFonts w:ascii="Calibri" w:cs="Calibri" w:eastAsia="Calibri" w:hAnsi="Calibri"/>
+        </w:rPr>
+        <w:t xml:space="preserve">Sign in and create account (email and password through Supabase); new accounts confirm by email and go straight to the profile form.</w:t>
+      </w:r>
+    </w:p>
+    <w:p>
+      <w:pPr>
+        <w:pStyle w:val="ListParagraph"/>
+        <w:numPr>
+          <w:ilvl w:val="0"/>
+          <w:numId w:val="2"/>
+        </w:numPr>
+        <w:spacing w:after="60"/>
+      </w:pPr>
+      <w:r>
+        <w:rPr>
+          <w:rFonts w:ascii="Calibri" w:cs="Calibri" w:eastAsia="Calibri" w:hAnsi="Calibri"/>
+        </w:rPr>
+        <w:t xml:space="preserve">Health profile: a 3-step form (about you, daily exposure, optional health details) saved once and reused; it can be edited at any time.</w:t>
+      </w:r>
+    </w:p>
+    <w:p>
+      <w:pPr>
+        <w:pStyle w:val="ListParagraph"/>
+        <w:numPr>
+          <w:ilvl w:val="0"/>
+          <w:numId w:val="2"/>
+        </w:numPr>
+        <w:spacing w:after="60"/>
+      </w:pPr>
+      <w:r>
+        <w:rPr>
+          <w:rFonts w:ascii="Calibri" w:cs="Calibri" w:eastAsia="Calibri" w:hAnsi="Calibri"/>
+        </w:rPr>
+        <w:t xml:space="preserve">My risk: the user's own day-by-day risk for 7 or 30 days in any of the six cities, with confidence, borderline ranges, a risk-score chart, the AQI forecast, precautions and a High/Severe callout.</w:t>
+      </w:r>
+    </w:p>
+    <w:p>
+      <w:pPr>
+        <w:pStyle w:val="ListParagraph"/>
+        <w:numPr>
+          <w:ilvl w:val="0"/>
+          <w:numId w:val="2"/>
+        </w:numPr>
+        <w:spacing w:after="60"/>
+      </w:pPr>
+      <w:r>
+        <w:rPr>
+          <w:rFonts w:ascii="Calibri" w:cs="Calibri" w:eastAsia="Calibri" w:hAnsi="Calibri"/>
+        </w:rPr>
+        <w:t xml:space="preserve">Each new estimate is saved to History, where past runs can be opened in full or deleted; the page reuses the latest run unless the profile changed, so visits don't create duplicates.</w:t>
+      </w:r>
+    </w:p>
+    <w:p>
+      <w:pPr>
+        <w:pStyle w:val="ListParagraph"/>
+        <w:numPr>
+          <w:ilvl w:val="0"/>
+          <w:numId w:val="2"/>
+        </w:numPr>
+        <w:spacing w:after="60"/>
+      </w:pPr>
+      <w:r>
+        <w:rPr>
+          <w:rFonts w:ascii="Calibri" w:cs="Calibri" w:eastAsia="Calibri" w:hAnsi="Calibri"/>
+        </w:rPr>
+        <w:t xml:space="preserve">Models page: leaderboards for AQI, PM2.5 and NO2 forecasting per city (gain over the naive forecast, all metrics, test windows) and for the health models (classification, regression, recall by risk level, borderline-day statistics).</w:t>
+      </w:r>
+    </w:p>
+    <w:p>
+      <w:pPr>
+        <w:pStyle w:val="ListParagraph"/>
+        <w:numPr>
+          <w:ilvl w:val="0"/>
+          <w:numId w:val="2"/>
+        </w:numPr>
+        <w:spacing w:after="60"/>
+      </w:pPr>
+      <w:r>
+        <w:rPr>
+          <w:rFonts w:ascii="Calibri" w:cs="Calibri" w:eastAsia="Calibri" w:hAnsi="Calibri"/>
+        </w:rPr>
+        <w:t xml:space="preserve">Type check, lint and production build pass; layouts checked at 1280, 1536 and 1920 px in light and dark.</w:t>
       </w:r>
     </w:p>
     <w:p>
@@ -4997,7 +5120,7 @@
                 <w:sz w:val="19"/>
                 <w:szCs w:val="19"/>
               </w:rPr>
-              <w:t xml:space="preserve">Frontend: remaining pages</w:t>
+              <w:t xml:space="preserve">Frontend: forecast detail page</w:t>
             </w:r>
           </w:p>
         </w:tc>
@@ -5026,7 +5149,7 @@
                 <w:sz w:val="19"/>
                 <w:szCs w:val="19"/>
               </w:rPr>
-              <w:t xml:space="preserve">Backend</w:t>
+              <w:t xml:space="preserve">Frontend</w:t>
             </w:r>
           </w:p>
         </w:tc>
@@ -5055,7 +5178,7 @@
                 <w:sz w:val="19"/>
                 <w:szCs w:val="19"/>
               </w:rPr>
-              <w:t xml:space="preserve">Sign-in, one-time profile wizard, my risk (day by day), history, models leaderboard, forecast detail</w:t>
+              <w:t xml:space="preserve">City forecast page (/forecast); the other pages are built</w:t>
             </w:r>
           </w:p>
         </w:tc>
@@ -5744,6 +5867,66 @@
                 <w:szCs w:val="19"/>
               </w:rPr>
               <w:t xml:space="preserve">What changed</w:t>
+            </w:r>
+          </w:p>
+        </w:tc>
+      </w:tr>
+      <w:tr>
+        <w:tc>
+          <w:tcPr>
+            <w:tcW w:type="dxa" w:w="1900"/>
+            <w:tcBorders>
+              <w:top w:val="single" w:color="BFBFBF" w:sz="4"/>
+              <w:left w:val="single" w:color="BFBFBF" w:sz="4"/>
+              <w:bottom w:val="single" w:color="BFBFBF" w:sz="4"/>
+              <w:right w:val="single" w:color="BFBFBF" w:sz="4"/>
+            </w:tcBorders>
+            <w:tcMar>
+              <w:top w:type="dxa" w:w="60"/>
+              <w:left w:type="dxa" w:w="100"/>
+              <w:bottom w:type="dxa" w:w="60"/>
+              <w:right w:type="dxa" w:w="100"/>
+            </w:tcMar>
+          </w:tcPr>
+          <w:p>
+            <w:r>
+              <w:rPr>
+                <w:rFonts w:ascii="Calibri" w:cs="Calibri" w:eastAsia="Calibri" w:hAnsi="Calibri"/>
+                <w:b w:val="false"/>
+                <w:bCs w:val="false"/>
+                <w:sz w:val="19"/>
+                <w:szCs w:val="19"/>
+              </w:rPr>
+              <w:t xml:space="preserve">6 Oct 2026</w:t>
+            </w:r>
+          </w:p>
+        </w:tc>
+        <w:tc>
+          <w:tcPr>
+            <w:tcW w:type="dxa" w:w="7738"/>
+            <w:tcBorders>
+              <w:top w:val="single" w:color="BFBFBF" w:sz="4"/>
+              <w:left w:val="single" w:color="BFBFBF" w:sz="4"/>
+              <w:bottom w:val="single" w:color="BFBFBF" w:sz="4"/>
+              <w:right w:val="single" w:color="BFBFBF" w:sz="4"/>
+            </w:tcBorders>
+            <w:tcMar>
+              <w:top w:type="dxa" w:w="60"/>
+              <w:left w:type="dxa" w:w="100"/>
+              <w:bottom w:type="dxa" w:w="60"/>
+              <w:right w:type="dxa" w:w="100"/>
+            </w:tcMar>
+          </w:tcPr>
+          <w:p>
+            <w:r>
+              <w:rPr>
+                <w:rFonts w:ascii="Calibri" w:cs="Calibri" w:eastAsia="Calibri" w:hAnsi="Calibri"/>
+                <w:b w:val="false"/>
+                <w:bCs w:val="false"/>
+                <w:sz w:val="19"/>
+                <w:szCs w:val="19"/>
+              </w:rPr>
+              <w:t xml:space="preserve">Sign-in, profile form, My risk, History and Models pages built.</w:t>
             </w:r>
           </w:p>
         </w:tc>

</xml_diff>

<commit_message>
Show risk score out of 100
Map the raw (unbounded) risk score to a 0-100 display scale where each
risk level fills a quarter. Applied to day cards, summary, score chart,
tooltips and the dashboard example. API and stored values are unchanged.

Co-Authored-By: Claude Sonnet 5.5 <noreply@anthropic.com>
</commit_message>
<xml_diff>
--- a/docs/Project_Progress.docx
+++ b/docs/Project_Progress.docx
@@ -5867,6 +5867,66 @@
                 <w:szCs w:val="19"/>
               </w:rPr>
               <w:t xml:space="preserve">What changed</w:t>
+            </w:r>
+          </w:p>
+        </w:tc>
+      </w:tr>
+      <w:tr>
+        <w:tc>
+          <w:tcPr>
+            <w:tcW w:type="dxa" w:w="1900"/>
+            <w:tcBorders>
+              <w:top w:val="single" w:color="BFBFBF" w:sz="4"/>
+              <w:left w:val="single" w:color="BFBFBF" w:sz="4"/>
+              <w:bottom w:val="single" w:color="BFBFBF" w:sz="4"/>
+              <w:right w:val="single" w:color="BFBFBF" w:sz="4"/>
+            </w:tcBorders>
+            <w:tcMar>
+              <w:top w:type="dxa" w:w="60"/>
+              <w:left w:type="dxa" w:w="100"/>
+              <w:bottom w:type="dxa" w:w="60"/>
+              <w:right w:type="dxa" w:w="100"/>
+            </w:tcMar>
+          </w:tcPr>
+          <w:p>
+            <w:r>
+              <w:rPr>
+                <w:rFonts w:ascii="Calibri" w:cs="Calibri" w:eastAsia="Calibri" w:hAnsi="Calibri"/>
+                <w:b w:val="false"/>
+                <w:bCs w:val="false"/>
+                <w:sz w:val="19"/>
+                <w:szCs w:val="19"/>
+              </w:rPr>
+              <w:t xml:space="preserve">6 Oct 2026</w:t>
+            </w:r>
+          </w:p>
+        </w:tc>
+        <w:tc>
+          <w:tcPr>
+            <w:tcW w:type="dxa" w:w="7738"/>
+            <w:tcBorders>
+              <w:top w:val="single" w:color="BFBFBF" w:sz="4"/>
+              <w:left w:val="single" w:color="BFBFBF" w:sz="4"/>
+              <w:bottom w:val="single" w:color="BFBFBF" w:sz="4"/>
+              <w:right w:val="single" w:color="BFBFBF" w:sz="4"/>
+            </w:tcBorders>
+            <w:tcMar>
+              <w:top w:type="dxa" w:w="60"/>
+              <w:left w:type="dxa" w:w="100"/>
+              <w:bottom w:type="dxa" w:w="60"/>
+              <w:right w:type="dxa" w:w="100"/>
+            </w:tcMar>
+          </w:tcPr>
+          <w:p>
+            <w:r>
+              <w:rPr>
+                <w:rFonts w:ascii="Calibri" w:cs="Calibri" w:eastAsia="Calibri" w:hAnsi="Calibri"/>
+                <w:b w:val="false"/>
+                <w:bCs w:val="false"/>
+                <w:sz w:val="19"/>
+                <w:szCs w:val="19"/>
+              </w:rPr>
+              <w:t xml:space="preserve">Risk score now shown out of 100 (each risk level fills a quarter of the scale).</w:t>
             </w:r>
           </w:p>
         </w:tc>

</xml_diff>

<commit_message>
Precautions follow the selected day's risk
Precautions used the week's highest alert level, so Low days showed
Moderate advice. They now follow the selected day (tomorrow by default),
day cards are clickable, and a note flags a later rise in risk.

Co-Authored-By: Claude Opus 5.5 <noreply@anthropic.com>
</commit_message>
<xml_diff>
--- a/docs/Project_Progress.docx
+++ b/docs/Project_Progress.docx
@@ -47,7 +47,7 @@
           <w:sz w:val="18"/>
           <w:szCs w:val="18"/>
         </w:rPr>
-        <w:t xml:space="preserve">Last updated: 6 October 2026    |    Latest commit: 75af4ea Landing page and dashboard; signed-in pages pending commit</w:t>
+        <w:t xml:space="preserve">Last updated: 7 October 2026    |    Latest commit: 75af4ea Landing page and dashboard; signed-in pages pending commit</w:t>
       </w:r>
     </w:p>
     <w:p>
@@ -5867,6 +5867,66 @@
                 <w:szCs w:val="19"/>
               </w:rPr>
               <w:t xml:space="preserve">What changed</w:t>
+            </w:r>
+          </w:p>
+        </w:tc>
+      </w:tr>
+      <w:tr>
+        <w:tc>
+          <w:tcPr>
+            <w:tcW w:type="dxa" w:w="1900"/>
+            <w:tcBorders>
+              <w:top w:val="single" w:color="BFBFBF" w:sz="4"/>
+              <w:left w:val="single" w:color="BFBFBF" w:sz="4"/>
+              <w:bottom w:val="single" w:color="BFBFBF" w:sz="4"/>
+              <w:right w:val="single" w:color="BFBFBF" w:sz="4"/>
+            </w:tcBorders>
+            <w:tcMar>
+              <w:top w:type="dxa" w:w="60"/>
+              <w:left w:type="dxa" w:w="100"/>
+              <w:bottom w:type="dxa" w:w="60"/>
+              <w:right w:type="dxa" w:w="100"/>
+            </w:tcMar>
+          </w:tcPr>
+          <w:p>
+            <w:r>
+              <w:rPr>
+                <w:rFonts w:ascii="Calibri" w:cs="Calibri" w:eastAsia="Calibri" w:hAnsi="Calibri"/>
+                <w:b w:val="false"/>
+                <w:bCs w:val="false"/>
+                <w:sz w:val="19"/>
+                <w:szCs w:val="19"/>
+              </w:rPr>
+              <w:t xml:space="preserve">7 Oct 2026</w:t>
+            </w:r>
+          </w:p>
+        </w:tc>
+        <w:tc>
+          <w:tcPr>
+            <w:tcW w:type="dxa" w:w="7738"/>
+            <w:tcBorders>
+              <w:top w:val="single" w:color="BFBFBF" w:sz="4"/>
+              <w:left w:val="single" w:color="BFBFBF" w:sz="4"/>
+              <w:bottom w:val="single" w:color="BFBFBF" w:sz="4"/>
+              <w:right w:val="single" w:color="BFBFBF" w:sz="4"/>
+            </w:tcBorders>
+            <w:tcMar>
+              <w:top w:type="dxa" w:w="60"/>
+              <w:left w:type="dxa" w:w="100"/>
+              <w:bottom w:type="dxa" w:w="60"/>
+              <w:right w:type="dxa" w:w="100"/>
+            </w:tcMar>
+          </w:tcPr>
+          <w:p>
+            <w:r>
+              <w:rPr>
+                <w:rFonts w:ascii="Calibri" w:cs="Calibri" w:eastAsia="Calibri" w:hAnsi="Calibri"/>
+                <w:b w:val="false"/>
+                <w:bCs w:val="false"/>
+                <w:sz w:val="19"/>
+                <w:szCs w:val="19"/>
+              </w:rPr>
+              <w:t xml:space="preserve">Precautions now follow the selected day's risk (tomorrow by default) instead of the week's highest level; day cards are clickable.</w:t>
             </w:r>
           </w:p>
         </w:tc>

</xml_diff>

<commit_message>
Add project working guide (theory and technical)
22-page Word guide covering data, time-series theory, forecasting and
health models, FastAPI, Supabase, the Next.js site, an end-to-end
walkthrough, limits and a glossary. Builder script in docs/guide.

Co-Authored-By: Claude Opus 5.5 <noreply@anthropic.com>
</commit_message>
<xml_diff>
--- a/docs/Project_Progress.docx
+++ b/docs/Project_Progress.docx
@@ -47,7 +47,7 @@
           <w:sz w:val="18"/>
           <w:szCs w:val="18"/>
         </w:rPr>
-        <w:t xml:space="preserve">Last updated: 7 October 2026    |    Latest commit: 75af4ea Landing page and dashboard; signed-in pages pending commit</w:t>
+        <w:t xml:space="preserve">Last updated: 8 October 2026    |    Latest commit: 75af4ea Landing page and dashboard; signed-in pages pending commit</w:t>
       </w:r>
     </w:p>
     <w:p>
@@ -5867,6 +5867,66 @@
                 <w:szCs w:val="19"/>
               </w:rPr>
               <w:t xml:space="preserve">What changed</w:t>
+            </w:r>
+          </w:p>
+        </w:tc>
+      </w:tr>
+      <w:tr>
+        <w:tc>
+          <w:tcPr>
+            <w:tcW w:type="dxa" w:w="1900"/>
+            <w:tcBorders>
+              <w:top w:val="single" w:color="BFBFBF" w:sz="4"/>
+              <w:left w:val="single" w:color="BFBFBF" w:sz="4"/>
+              <w:bottom w:val="single" w:color="BFBFBF" w:sz="4"/>
+              <w:right w:val="single" w:color="BFBFBF" w:sz="4"/>
+            </w:tcBorders>
+            <w:tcMar>
+              <w:top w:type="dxa" w:w="60"/>
+              <w:left w:type="dxa" w:w="100"/>
+              <w:bottom w:type="dxa" w:w="60"/>
+              <w:right w:type="dxa" w:w="100"/>
+            </w:tcMar>
+          </w:tcPr>
+          <w:p>
+            <w:r>
+              <w:rPr>
+                <w:rFonts w:ascii="Calibri" w:cs="Calibri" w:eastAsia="Calibri" w:hAnsi="Calibri"/>
+                <w:b w:val="false"/>
+                <w:bCs w:val="false"/>
+                <w:sz w:val="19"/>
+                <w:szCs w:val="19"/>
+              </w:rPr>
+              <w:t xml:space="preserve">8 Oct 2026</w:t>
+            </w:r>
+          </w:p>
+        </w:tc>
+        <w:tc>
+          <w:tcPr>
+            <w:tcW w:type="dxa" w:w="7738"/>
+            <w:tcBorders>
+              <w:top w:val="single" w:color="BFBFBF" w:sz="4"/>
+              <w:left w:val="single" w:color="BFBFBF" w:sz="4"/>
+              <w:bottom w:val="single" w:color="BFBFBF" w:sz="4"/>
+              <w:right w:val="single" w:color="BFBFBF" w:sz="4"/>
+            </w:tcBorders>
+            <w:tcMar>
+              <w:top w:type="dxa" w:w="60"/>
+              <w:left w:type="dxa" w:w="100"/>
+              <w:bottom w:type="dxa" w:w="60"/>
+              <w:right w:type="dxa" w:w="100"/>
+            </w:tcMar>
+          </w:tcPr>
+          <w:p>
+            <w:r>
+              <w:rPr>
+                <w:rFonts w:ascii="Calibri" w:cs="Calibri" w:eastAsia="Calibri" w:hAnsi="Calibri"/>
+                <w:b w:val="false"/>
+                <w:bCs w:val="false"/>
+                <w:sz w:val="19"/>
+                <w:szCs w:val="19"/>
+              </w:rPr>
+              <w:t xml:space="preserve">Project working guide written (22 pages, theory and technical): docs/Project_Working_Guide.docx.</w:t>
             </w:r>
           </w:p>
         </w:tc>

</xml_diff>